<commit_message>
CFA - MD ajustado - repositorio
</commit_message>
<xml_diff>
--- a/fuentes/12310175_CF2_DU.docx
+++ b/fuentes/12310175_CF2_DU.docx
@@ -1,10 +1,10 @@
 
 <file path=word/document.xml><?xml version="1.0" encoding="utf-8"?>
-<w:document xmlns:wpc="http://schemas.microsoft.com/office/word/2010/wordprocessingCanvas" xmlns:cx="http://schemas.microsoft.com/office/drawing/2014/chartex" xmlns:cx1="http://schemas.microsoft.com/office/drawing/2015/9/8/chartex" xmlns:cx2="http://schemas.microsoft.com/office/drawing/2015/10/21/chartex" xmlns:cx3="http://schemas.microsoft.com/office/drawing/2016/5/9/chartex" xmlns:cx4="http://schemas.microsoft.com/office/drawing/2016/5/10/chartex" xmlns:cx5="http://schemas.microsoft.com/office/drawing/2016/5/11/chartex" xmlns:cx6="http://schemas.microsoft.com/office/drawing/2016/5/12/chartex" xmlns:cx7="http://schemas.microsoft.com/office/drawing/2016/5/13/chartex" xmlns:cx8="http://schemas.microsoft.com/office/drawing/2016/5/14/chartex" xmlns:mc="http://schemas.openxmlformats.org/markup-compatibility/2006" xmlns:aink="http://schemas.microsoft.com/office/drawing/2016/ink" xmlns:am3d="http://schemas.microsoft.com/office/drawing/2017/model3d" xmlns:o="urn:schemas-microsoft-com:office:office" xmlns:r="http://schemas.openxmlformats.org/officeDocument/2006/relationships" xmlns:m="http://schemas.openxmlformats.org/officeDocument/2006/math" xmlns:v="urn:schemas-microsoft-com:vml" xmlns:wp14="http://schemas.microsoft.com/office/word/2010/wordprocessingDrawing" xmlns:wp="http://schemas.openxmlformats.org/drawingml/2006/wordprocessingDrawing" xmlns:w10="urn:schemas-microsoft-com:office:word" xmlns:w="http://schemas.openxmlformats.org/wordprocessingml/2006/main" xmlns:w14="http://schemas.microsoft.com/office/word/2010/wordml" xmlns:w15="http://schemas.microsoft.com/office/word/2012/wordml" xmlns:w16cex="http://schemas.microsoft.com/office/word/2018/wordml/cex" xmlns:w16cid="http://schemas.microsoft.com/office/word/2016/wordml/cid" xmlns:w16="http://schemas.microsoft.com/office/word/2018/wordml" xmlns:w16sdtdh="http://schemas.microsoft.com/office/word/2020/wordml/sdtdatahash" xmlns:w16se="http://schemas.microsoft.com/office/word/2015/wordml/symex" xmlns:wpg="http://schemas.microsoft.com/office/word/2010/wordprocessingGroup" xmlns:wpi="http://schemas.microsoft.com/office/word/2010/wordprocessingInk" xmlns:wne="http://schemas.microsoft.com/office/word/2006/wordml" xmlns:wps="http://schemas.microsoft.com/office/word/2010/wordprocessingShape" mc:Ignorable="w14 w15 w16se w16cid w16 w16cex w16sdtdh wp14">
+<w:document xmlns:wpc="http://schemas.microsoft.com/office/word/2010/wordprocessingCanvas" xmlns:cx="http://schemas.microsoft.com/office/drawing/2014/chartex" xmlns:cx1="http://schemas.microsoft.com/office/drawing/2015/9/8/chartex" xmlns:cx2="http://schemas.microsoft.com/office/drawing/2015/10/21/chartex" xmlns:cx3="http://schemas.microsoft.com/office/drawing/2016/5/9/chartex" xmlns:cx4="http://schemas.microsoft.com/office/drawing/2016/5/10/chartex" xmlns:cx5="http://schemas.microsoft.com/office/drawing/2016/5/11/chartex" xmlns:cx6="http://schemas.microsoft.com/office/drawing/2016/5/12/chartex" xmlns:cx7="http://schemas.microsoft.com/office/drawing/2016/5/13/chartex" xmlns:cx8="http://schemas.microsoft.com/office/drawing/2016/5/14/chartex" xmlns:mc="http://schemas.openxmlformats.org/markup-compatibility/2006" xmlns:aink="http://schemas.microsoft.com/office/drawing/2016/ink" xmlns:am3d="http://schemas.microsoft.com/office/drawing/2017/model3d" xmlns:o="urn:schemas-microsoft-com:office:office" xmlns:oel="http://schemas.microsoft.com/office/2019/extlst" xmlns:r="http://schemas.openxmlformats.org/officeDocument/2006/relationships" xmlns:m="http://schemas.openxmlformats.org/officeDocument/2006/math" xmlns:v="urn:schemas-microsoft-com:vml" xmlns:wp14="http://schemas.microsoft.com/office/word/2010/wordprocessingDrawing" xmlns:wp="http://schemas.openxmlformats.org/drawingml/2006/wordprocessingDrawing" xmlns:w10="urn:schemas-microsoft-com:office:word" xmlns:w="http://schemas.openxmlformats.org/wordprocessingml/2006/main" xmlns:w14="http://schemas.microsoft.com/office/word/2010/wordml" xmlns:w15="http://schemas.microsoft.com/office/word/2012/wordml" xmlns:w16cex="http://schemas.microsoft.com/office/word/2018/wordml/cex" xmlns:w16cid="http://schemas.microsoft.com/office/word/2016/wordml/cid" xmlns:w16="http://schemas.microsoft.com/office/word/2018/wordml" xmlns:w16du="http://schemas.microsoft.com/office/word/2023/wordml/word16du" xmlns:w16sdtdh="http://schemas.microsoft.com/office/word/2020/wordml/sdtdatahash" xmlns:w16sdtfl="http://schemas.microsoft.com/office/word/2024/wordml/sdtformatlock" xmlns:w16se="http://schemas.microsoft.com/office/word/2015/wordml/symex" xmlns:wpg="http://schemas.microsoft.com/office/word/2010/wordprocessingGroup" xmlns:wpi="http://schemas.microsoft.com/office/word/2010/wordprocessingInk" xmlns:wne="http://schemas.microsoft.com/office/word/2006/wordml" xmlns:wps="http://schemas.microsoft.com/office/word/2010/wordprocessingShape" mc:Ignorable="w14 w15 w16se w16cid w16 w16cex w16sdtdh w16sdtfl w16du wp14">
   <w:body>
     <w:p>
       <w:pPr>
-        <w:ind w:left="708" w:firstLine="1"/>
+        <w:ind w:left="1416" w:hanging="707"/>
       </w:pPr>
       <w:r>
         <w:rPr>
@@ -353,7 +353,7 @@
               </wp:anchor>
             </w:drawing>
           </mc:Choice>
-          <mc:Fallback xmlns:oel="http://schemas.microsoft.com/office/2019/extlst" xmlns:asvg="http://schemas.microsoft.com/office/drawing/2016/SVG/main" xmlns:a14="http://schemas.microsoft.com/office/drawing/2010/main" xmlns:pic="http://schemas.openxmlformats.org/drawingml/2006/picture" xmlns:adec="http://schemas.microsoft.com/office/drawing/2017/decorative" xmlns:a="http://schemas.openxmlformats.org/drawingml/2006/main">
+          <mc:Fallback xmlns:a="http://schemas.openxmlformats.org/drawingml/2006/main" xmlns:adec="http://schemas.microsoft.com/office/drawing/2017/decorative" xmlns:pic="http://schemas.openxmlformats.org/drawingml/2006/picture" xmlns:a14="http://schemas.microsoft.com/office/drawing/2010/main" xmlns:asvg="http://schemas.microsoft.com/office/drawing/2016/SVG/main">
             <w:pict>
               <v:rect id="Rectángulo 3" style="position:absolute;margin-left:-55.95pt;margin-top:26.4pt;width:613.85pt;height:164.25pt;z-index:-251655168;visibility:visible;mso-wrap-style:square;mso-height-percent:0;mso-wrap-distance-left:9pt;mso-wrap-distance-top:0;mso-wrap-distance-right:9pt;mso-wrap-distance-bottom:0;mso-position-horizontal:absolute;mso-position-horizontal-relative:text;mso-position-vertical:absolute;mso-position-vertical-relative:text;mso-height-percent:0;mso-height-relative:margin;v-text-anchor:middle" alt="&quot;&quot;" o:spid="_x0000_s1026" fillcolor="#00314d" stroked="f" strokeweight="1pt" w14:anchorId="44ECBD1E" o:gfxdata="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"/>
             </w:pict>
@@ -559,7 +559,6 @@
           <w:docPartUnique/>
         </w:docPartObj>
       </w:sdtPr>
-      <w:sdtEndPr/>
       <w:sdtContent>
         <w:p>
           <w:pPr>
@@ -1973,12 +1972,12 @@
                 <w:b/>
                 <w:bCs/>
               </w:rPr>
-              <w:t>Cortina Musical</w:t>
-            </w:r>
-          </w:p>
-          <w:p>
-            <w:r>
-              <w:t xml:space="preserve">https://pixabay.com/music/upbeat-fun-upbeat-background-music-368028/ </w:t>
+              <w:t>Mujer</w:t>
+            </w:r>
+          </w:p>
+          <w:p>
+            <w:r>
+              <w:t>¡Hola! Hoy vamos a ponerle ritmo a la contabilidad y le vamos a quitar el misterio a una herramienta básica: la famosa Cuenta T.</w:t>
             </w:r>
           </w:p>
           <w:p>
@@ -1993,12 +1992,12 @@
                 <w:b/>
                 <w:bCs/>
               </w:rPr>
-              <w:t>Mujer</w:t>
-            </w:r>
-          </w:p>
-          <w:p>
-            <w:r>
-              <w:t>¡Hola! Hoy vamos a ponerle ritmo a la contabilidad y le vamos a quitar el misterio a una herramienta básica: la famosa Cuenta T.</w:t>
+              <w:t>Hombre</w:t>
+            </w:r>
+          </w:p>
+          <w:p>
+            <w:r>
+              <w:t>Puede parecer simple, pero es el corazón de cómo entendemos el dinero en contabilidad.</w:t>
             </w:r>
           </w:p>
           <w:p>
@@ -2013,12 +2012,12 @@
                 <w:b/>
                 <w:bCs/>
               </w:rPr>
-              <w:t>Hombre</w:t>
-            </w:r>
-          </w:p>
-          <w:p>
-            <w:r>
-              <w:t>Puede parecer simple, pero es el corazón de cómo entendemos el dinero en contabilidad.</w:t>
+              <w:t>Mujer</w:t>
+            </w:r>
+          </w:p>
+          <w:p>
+            <w:r>
+              <w:t>Ya sabemos cómo se ve una Cuenta T. Ahora viene lo más importante: cómo se llena.</w:t>
             </w:r>
           </w:p>
           <w:p>
@@ -2033,13 +2032,13 @@
                 <w:b/>
                 <w:bCs/>
               </w:rPr>
-              <w:t>Mujer</w:t>
-            </w:r>
-          </w:p>
-          <w:p>
-            <w:r>
               <w:lastRenderedPageBreak/>
-              <w:t>Ya sabemos cómo se ve una Cuenta T. Ahora viene lo más importante: cómo se llena.</w:t>
+              <w:t>Hombre</w:t>
+            </w:r>
+          </w:p>
+          <w:p>
+            <w:r>
+              <w:t>Porque registrar valores también tiene su propio lenguaje.</w:t>
             </w:r>
           </w:p>
           <w:p>
@@ -2054,12 +2053,12 @@
                 <w:b/>
                 <w:bCs/>
               </w:rPr>
-              <w:t>Hombre</w:t>
-            </w:r>
-          </w:p>
-          <w:p>
-            <w:r>
-              <w:t>Porque registrar valores también tiene su propio lenguaje.</w:t>
+              <w:t>Mujer</w:t>
+            </w:r>
+          </w:p>
+          <w:p>
+            <w:r>
+              <w:t>Ahora vamos al otro lado.</w:t>
             </w:r>
           </w:p>
           <w:p>
@@ -2074,12 +2073,12 @@
                 <w:b/>
                 <w:bCs/>
               </w:rPr>
-              <w:t>Cortina Musical</w:t>
-            </w:r>
-          </w:p>
-          <w:p>
-            <w:r>
-              <w:t>https://pixabay.com/music/upbeat-fun-upbeat-background-music-368028/ 1:20-1:24</w:t>
+              <w:t>Hombre</w:t>
+            </w:r>
+          </w:p>
+          <w:p>
+            <w:r>
+              <w:t>La columna de la derecha, el “Haber”. Registrar ahí se llama acreditar.</w:t>
             </w:r>
           </w:p>
           <w:p>
@@ -2099,7 +2098,12 @@
           </w:p>
           <w:p>
             <w:r>
-              <w:t>Ahora vamos al otro lado.</w:t>
+              <w:t>Fácil de recordar: izquierda, debitar.</w:t>
+            </w:r>
+          </w:p>
+          <w:p>
+            <w:r>
+              <w:t>Derecha, acreditar.</w:t>
             </w:r>
           </w:p>
           <w:p>
@@ -2119,7 +2123,7 @@
           </w:p>
           <w:p>
             <w:r>
-              <w:t>La columna de la derecha, el “Haber”. Registrar ahí se llama acreditar.</w:t>
+              <w:t>Pero aquí aparece otro elemento clave: los movimientos.</w:t>
             </w:r>
           </w:p>
           <w:p>
@@ -2139,12 +2143,7 @@
           </w:p>
           <w:p>
             <w:r>
-              <w:t>Fácil de recordar: izquierda, debitar.</w:t>
-            </w:r>
-          </w:p>
-          <w:p>
-            <w:r>
-              <w:t>Derecha, acreditar.</w:t>
+              <w:t>Si sumas todos los valores del lado izquierdo… obtienes el movimiento débito.</w:t>
             </w:r>
           </w:p>
           <w:p>
@@ -2164,7 +2163,7 @@
           </w:p>
           <w:p>
             <w:r>
-              <w:t>Pero aquí aparece otro elemento clave: los movimientos.</w:t>
+              <w:t>Y si sumas los del lado derecho… tienes el movimiento crédito.</w:t>
             </w:r>
           </w:p>
           <w:p>
@@ -2184,7 +2183,7 @@
           </w:p>
           <w:p>
             <w:r>
-              <w:t>Si sumas todos los valores del lado izquierdo… obtienes el movimiento débito.</w:t>
+              <w:t>Es como mirar cada lado de una balanza.</w:t>
             </w:r>
           </w:p>
           <w:p>
@@ -2205,7 +2204,7 @@
           <w:p>
             <w:r>
               <w:lastRenderedPageBreak/>
-              <w:t>Y si sumas los del lado derecho… tienes el movimiento crédito.</w:t>
+              <w:t>Ahora viene la gran pregunta: después de registrar todo… ¿qué queda realmente en la cuenta?</w:t>
             </w:r>
           </w:p>
           <w:p>
@@ -2225,7 +2224,7 @@
           </w:p>
           <w:p>
             <w:r>
-              <w:t>Es como mirar cada lado de una balanza.</w:t>
+              <w:t>Pues ahí aparece el saldo.</w:t>
             </w:r>
           </w:p>
           <w:p>
@@ -2240,12 +2239,12 @@
                 <w:b/>
                 <w:bCs/>
               </w:rPr>
-              <w:t>Cortina Musical</w:t>
-            </w:r>
-          </w:p>
-          <w:p>
-            <w:r>
-              <w:t xml:space="preserve">https://pixabay.com/music/funk-copyright-free-funky-electronic-loop-short-upbeat-groove-for-videos-474209/ </w:t>
+              <w:t>Hombre</w:t>
+            </w:r>
+          </w:p>
+          <w:p>
+            <w:r>
+              <w:t>Y calcularlo es más sencillo de lo que parece.</w:t>
             </w:r>
           </w:p>
           <w:p>
@@ -2260,12 +2259,12 @@
                 <w:b/>
                 <w:bCs/>
               </w:rPr>
-              <w:t>Hombre</w:t>
-            </w:r>
-          </w:p>
-          <w:p>
-            <w:r>
-              <w:t>Ahora viene la gran pregunta: después de registrar todo… ¿qué queda realmente en la cuenta?</w:t>
+              <w:t>Mujer</w:t>
+            </w:r>
+          </w:p>
+          <w:p>
+            <w:r>
+              <w:t>Solo comparas los movimientos.</w:t>
             </w:r>
           </w:p>
           <w:p>
@@ -2280,12 +2279,12 @@
                 <w:b/>
                 <w:bCs/>
               </w:rPr>
-              <w:t>Mujer</w:t>
-            </w:r>
-          </w:p>
-          <w:p>
-            <w:r>
-              <w:t>Pues ahí aparece el saldo.</w:t>
+              <w:t>Hombre</w:t>
+            </w:r>
+          </w:p>
+          <w:p>
+            <w:r>
+              <w:t>Restas el menor del mayor… y listo.</w:t>
             </w:r>
           </w:p>
           <w:p>
@@ -2300,27 +2299,12 @@
                 <w:b/>
                 <w:bCs/>
               </w:rPr>
-              <w:t>Hombre</w:t>
-            </w:r>
-          </w:p>
-          <w:p>
-            <w:r>
-              <w:t xml:space="preserve">(Efecto de sonido </w:t>
-            </w:r>
-          </w:p>
-          <w:p>
-            <w:hyperlink r:id="rId12" w:history="1">
-              <w:r>
-                <w:rPr>
-                  <w:rStyle w:val="Hipervnculo"/>
-                </w:rPr>
-                <w:t>https://freesound.org/people/Drumartist/sounds/512670/</w:t>
-              </w:r>
-            </w:hyperlink>
-          </w:p>
-          <w:p>
-            <w:r>
-              <w:t>Y calcularlo es más sencillo de lo que parece.</w:t>
+              <w:t>Mujer</w:t>
+            </w:r>
+          </w:p>
+          <w:p>
+            <w:r>
+              <w:t>Ese resultado te dice lo que estas buscando…</w:t>
             </w:r>
           </w:p>
           <w:p>
@@ -2335,12 +2319,12 @@
                 <w:b/>
                 <w:bCs/>
               </w:rPr>
-              <w:t>Mujer</w:t>
-            </w:r>
-          </w:p>
-          <w:p>
-            <w:r>
-              <w:t>Solo comparas los movimientos.</w:t>
+              <w:t>Hombre</w:t>
+            </w:r>
+          </w:p>
+          <w:p>
+            <w:r>
+              <w:t>Si el saldo es débito… o crédito.</w:t>
             </w:r>
           </w:p>
           <w:p>
@@ -2355,12 +2339,17 @@
                 <w:b/>
                 <w:bCs/>
               </w:rPr>
-              <w:t>Hombre</w:t>
-            </w:r>
-          </w:p>
-          <w:p>
-            <w:r>
-              <w:t>Restas el menor del mayor… y listo.</w:t>
+              <w:t>Mujer</w:t>
+            </w:r>
+          </w:p>
+          <w:p>
+            <w:r>
+              <w:t>En pocas palabras: debitas a la izquierda, acreditas a la derecha,</w:t>
+            </w:r>
+          </w:p>
+          <w:p>
+            <w:r>
+              <w:t>sumas para ver movimientos… y restas para encontrar el saldo.</w:t>
             </w:r>
           </w:p>
           <w:p>
@@ -2375,143 +2364,34 @@
                 <w:b/>
                 <w:bCs/>
               </w:rPr>
+              <w:t>Hombre</w:t>
+            </w:r>
+          </w:p>
+          <w:p>
+            <w:r>
+              <w:t>Así de simple.</w:t>
+            </w:r>
+          </w:p>
+          <w:p>
+            <w:pPr>
+              <w:rPr>
+                <w:b/>
+                <w:bCs/>
+              </w:rPr>
+            </w:pPr>
+            <w:r>
+              <w:rPr>
+                <w:b/>
+                <w:bCs/>
+              </w:rPr>
               <w:lastRenderedPageBreak/>
               <w:t>Mujer</w:t>
             </w:r>
           </w:p>
           <w:p>
             <w:r>
-              <w:t>Ese resultado te dice lo que estas buscando…</w:t>
-            </w:r>
-          </w:p>
-          <w:p>
-            <w:pPr>
-              <w:rPr>
-                <w:b/>
-                <w:bCs/>
-              </w:rPr>
-            </w:pPr>
-            <w:r>
-              <w:rPr>
-                <w:b/>
-                <w:bCs/>
-              </w:rPr>
-              <w:t>Hombre</w:t>
-            </w:r>
-          </w:p>
-          <w:p>
-            <w:r>
-              <w:t>Si el saldo es débito… o crédito.</w:t>
-            </w:r>
-          </w:p>
-          <w:p>
-            <w:pPr>
-              <w:rPr>
-                <w:b/>
-                <w:bCs/>
-              </w:rPr>
-            </w:pPr>
-            <w:r>
-              <w:rPr>
-                <w:b/>
-                <w:bCs/>
-              </w:rPr>
-              <w:t>Cortina Musical</w:t>
-            </w:r>
-          </w:p>
-          <w:p>
-            <w:hyperlink r:id="rId13" w:history="1">
-              <w:r>
-                <w:rPr>
-                  <w:rStyle w:val="Hipervnculo"/>
-                </w:rPr>
-                <w:t>https://pixabay.com/music/funk-upbeat-funky-206965/</w:t>
-              </w:r>
-            </w:hyperlink>
-            <w:r>
-              <w:t xml:space="preserve"> </w:t>
-            </w:r>
-          </w:p>
-          <w:p>
-            <w:r>
-              <w:t>3-4 segundos y se mantiene suave hasta la línea #27, luego sube y cierra el programa.</w:t>
-            </w:r>
-          </w:p>
-          <w:p>
-            <w:pPr>
-              <w:rPr>
-                <w:b/>
-                <w:bCs/>
-              </w:rPr>
-            </w:pPr>
-            <w:r>
-              <w:rPr>
-                <w:b/>
-                <w:bCs/>
-              </w:rPr>
-              <w:t>Mujer</w:t>
-            </w:r>
-          </w:p>
-          <w:p>
-            <w:r>
-              <w:t>En pocas palabras: debitas a la izquierda, acreditas a la derecha,</w:t>
-            </w:r>
-          </w:p>
-          <w:p>
-            <w:r>
-              <w:t>sumas para ver movimientos… y restas para encontrar el saldo.</w:t>
-            </w:r>
-          </w:p>
-          <w:p>
-            <w:pPr>
-              <w:rPr>
-                <w:b/>
-                <w:bCs/>
-              </w:rPr>
-            </w:pPr>
-            <w:r>
-              <w:rPr>
-                <w:b/>
-                <w:bCs/>
-              </w:rPr>
-              <w:t>Hombre</w:t>
-            </w:r>
-          </w:p>
-          <w:p>
-            <w:r>
-              <w:t>Así de simple.</w:t>
-            </w:r>
-          </w:p>
-          <w:p>
-            <w:pPr>
-              <w:rPr>
-                <w:b/>
-                <w:bCs/>
-              </w:rPr>
-            </w:pPr>
-            <w:r>
-              <w:rPr>
-                <w:b/>
-                <w:bCs/>
-              </w:rPr>
-              <w:t>Mujer</w:t>
-            </w:r>
-          </w:p>
-          <w:p>
-            <w:r>
               <w:t>Cuando entiendes su funcionamiento… la Cuenta T se convierte en una excelente aliada.</w:t>
             </w:r>
-          </w:p>
-          <w:p/>
-          <w:p>
-            <w:pPr>
-              <w:ind w:firstLine="0"/>
-            </w:pPr>
-          </w:p>
-          <w:p>
-            <w:pPr>
-              <w:ind w:firstLine="0"/>
-            </w:pPr>
           </w:p>
         </w:tc>
       </w:tr>
@@ -2693,14 +2573,14 @@
         <w:rPr>
           <w:lang w:val="es-419" w:eastAsia="es-CO"/>
         </w:rPr>
-        <w:t xml:space="preserve"> Los gastos constituyen disminuciones del patrimonio neto de una organización que no tienen su origen en distribuciones de fondos a los propietarios, sino que derivan de la actividad económica de adquisición de bienes y servicios, o de variaciones en el valor de activos y pasivos que requieren reconocimiento contable. Este fenómeno se materializa de forma efectiva mediante la entrega o reducción de activos o la asunción de nuevos pasivos (o una </w:t>
+        <w:t xml:space="preserve"> Los gastos constituyen disminuciones del patrimonio neto de una organización que no tienen su origen en distribuciones de fondos a los </w:t>
       </w:r>
       <w:r>
         <w:rPr>
           <w:lang w:val="es-419" w:eastAsia="es-CO"/>
         </w:rPr>
         <w:lastRenderedPageBreak/>
-        <w:t>combinación de ambos), lo que representa una salida de recursos o un incremento de las obligaciones financieras para la organización.</w:t>
+        <w:t>propietarios, sino que derivan de la actividad económica de adquisición de bienes y servicios, o de variaciones en el valor de activos y pasivos que requieren reconocimiento contable. Este fenómeno se materializa de forma efectiva mediante la entrega o reducción de activos o la asunción de nuevos pasivos (o una combinación de ambos), lo que representa una salida de recursos o un incremento de las obligaciones financieras para la organización.</w:t>
       </w:r>
     </w:p>
     <w:p>
@@ -2843,6 +2723,7 @@
         <w:rPr>
           <w:rStyle w:val="Ttulo5Car"/>
         </w:rPr>
+        <w:lastRenderedPageBreak/>
         <w:t>Clasificación.</w:t>
       </w:r>
       <w:r>
@@ -2868,7 +2749,6 @@
         <w:rPr>
           <w:rStyle w:val="Ttulo5Car"/>
         </w:rPr>
-        <w:lastRenderedPageBreak/>
         <w:t>Cierre contable.</w:t>
       </w:r>
       <w:r>
@@ -2937,8 +2817,8 @@
         <w:tblLook w:val="04A0" w:firstRow="1" w:lastRow="0" w:firstColumn="1" w:lastColumn="0" w:noHBand="0" w:noVBand="1"/>
       </w:tblPr>
       <w:tblGrid>
-        <w:gridCol w:w="1396"/>
-        <w:gridCol w:w="6104"/>
+        <w:gridCol w:w="1403"/>
+        <w:gridCol w:w="6097"/>
       </w:tblGrid>
       <w:tr>
         <w:trPr>
@@ -3017,7 +2897,7 @@
                 <w:color w:val="12263F"/>
                 <w:szCs w:val="24"/>
               </w:rPr>
-              <w:t>INGRESOS</w:t>
+              <w:t>ingresos</w:t>
             </w:r>
           </w:p>
         </w:tc>
@@ -3112,7 +2992,7 @@
                 <w:color w:val="12263F"/>
                 <w:szCs w:val="24"/>
               </w:rPr>
-              <w:t>Comercio al por mayor y al por menor</w:t>
+              <w:t>comercio al por mayor y al por menor</w:t>
             </w:r>
           </w:p>
         </w:tc>
@@ -3158,7 +3038,7 @@
                 <w:color w:val="12263F"/>
                 <w:szCs w:val="24"/>
               </w:rPr>
-              <w:t>Hoteles y restaurantes</w:t>
+              <w:t>hoteles y restaurantes</w:t>
             </w:r>
           </w:p>
         </w:tc>
@@ -3253,7 +3133,7 @@
                 <w:color w:val="12263F"/>
                 <w:szCs w:val="24"/>
               </w:rPr>
-              <w:t>Financieros</w:t>
+              <w:t>financieros</w:t>
             </w:r>
           </w:p>
         </w:tc>
@@ -3302,7 +3182,7 @@
                 <w:color w:val="12263F"/>
                 <w:szCs w:val="24"/>
               </w:rPr>
-              <w:t>Arrendamientos</w:t>
+              <w:t>arrendamientos</w:t>
             </w:r>
           </w:p>
         </w:tc>
@@ -3348,7 +3228,7 @@
                 <w:color w:val="12263F"/>
                 <w:szCs w:val="24"/>
               </w:rPr>
-              <w:t>Comisiones.</w:t>
+              <w:t>comisiones</w:t>
             </w:r>
           </w:p>
         </w:tc>
@@ -3359,6 +3239,7 @@
         <w:pStyle w:val="Ttulo3"/>
       </w:pPr>
       <w:r>
+        <w:lastRenderedPageBreak/>
         <w:t>Gastos</w:t>
       </w:r>
     </w:p>
@@ -3440,7 +3321,6 @@
         <w:rPr>
           <w:rStyle w:val="Ttulo5Car"/>
         </w:rPr>
-        <w:lastRenderedPageBreak/>
         <w:t>Clasificación.</w:t>
       </w:r>
       <w:r>
@@ -3709,7 +3589,7 @@
                 <w:color w:val="12263F"/>
                 <w:szCs w:val="24"/>
               </w:rPr>
-              <w:t>Gastos de personal</w:t>
+              <w:t>gastos de personal</w:t>
             </w:r>
           </w:p>
         </w:tc>
@@ -3755,7 +3635,7 @@
                 <w:color w:val="12263F"/>
                 <w:szCs w:val="24"/>
               </w:rPr>
-              <w:t>Honorarios</w:t>
+              <w:t>honorarios</w:t>
             </w:r>
           </w:p>
         </w:tc>
@@ -3899,7 +3779,7 @@
                 <w:color w:val="12263F"/>
                 <w:szCs w:val="24"/>
               </w:rPr>
-              <w:t>Gastos</w:t>
+              <w:t>gastos</w:t>
             </w:r>
           </w:p>
         </w:tc>
@@ -3923,6 +3803,7 @@
                 <w:color w:val="12263F"/>
                 <w:szCs w:val="24"/>
               </w:rPr>
+              <w:lastRenderedPageBreak/>
               <w:t>5210</w:t>
             </w:r>
           </w:p>
@@ -3945,7 +3826,7 @@
                 <w:color w:val="12263F"/>
                 <w:szCs w:val="24"/>
               </w:rPr>
-              <w:t>Honorarios.</w:t>
+              <w:t>honorarios</w:t>
             </w:r>
           </w:p>
         </w:tc>
@@ -4005,7 +3886,6 @@
         <w:pStyle w:val="Ttulo3"/>
       </w:pPr>
       <w:r>
-        <w:lastRenderedPageBreak/>
         <w:t>Costos de ventas</w:t>
       </w:r>
     </w:p>
@@ -4261,6 +4141,7 @@
                 <w:color w:val="12263F"/>
                 <w:szCs w:val="24"/>
               </w:rPr>
+              <w:lastRenderedPageBreak/>
               <w:t>61</w:t>
             </w:r>
           </w:p>
@@ -4356,7 +4237,6 @@
                 <w:color w:val="12263F"/>
                 <w:szCs w:val="24"/>
               </w:rPr>
-              <w:lastRenderedPageBreak/>
               <w:t>6135</w:t>
             </w:r>
           </w:p>
@@ -4614,13 +4494,13 @@
                     <pic:cNvPicPr/>
                   </pic:nvPicPr>
                   <pic:blipFill>
-                    <a:blip r:embed="rId14">
+                    <a:blip r:embed="rId12">
                       <a:extLst>
                         <a:ext uri="{28A0092B-C50C-407E-A947-70E740481C1C}">
                           <a14:useLocalDpi xmlns:a14="http://schemas.microsoft.com/office/drawing/2010/main" val="0"/>
                         </a:ext>
                         <a:ext uri="{96DAC541-7B7A-43D3-8B79-37D633B846F1}">
-                          <asvg:svgBlip xmlns:asvg="http://schemas.microsoft.com/office/drawing/2016/SVG/main" r:embed="rId15"/>
+                          <asvg:svgBlip xmlns:asvg="http://schemas.microsoft.com/office/drawing/2016/SVG/main" r:embed="rId13"/>
                         </a:ext>
                       </a:extLst>
                     </a:blip>
@@ -4663,7 +4543,6 @@
         <w:pStyle w:val="Ttulo5"/>
       </w:pPr>
       <w:r>
-        <w:lastRenderedPageBreak/>
         <w:t>Gastos</w:t>
       </w:r>
     </w:p>
@@ -4722,13 +4601,13 @@
                     <pic:cNvPicPr/>
                   </pic:nvPicPr>
                   <pic:blipFill>
-                    <a:blip r:embed="rId16">
+                    <a:blip r:embed="rId14">
                       <a:extLst>
                         <a:ext uri="{28A0092B-C50C-407E-A947-70E740481C1C}">
                           <a14:useLocalDpi xmlns:a14="http://schemas.microsoft.com/office/drawing/2010/main" val="0"/>
                         </a:ext>
                         <a:ext uri="{96DAC541-7B7A-43D3-8B79-37D633B846F1}">
-                          <asvg:svgBlip xmlns:asvg="http://schemas.microsoft.com/office/drawing/2016/SVG/main" r:embed="rId17"/>
+                          <asvg:svgBlip xmlns:asvg="http://schemas.microsoft.com/office/drawing/2016/SVG/main" r:embed="rId15"/>
                         </a:ext>
                       </a:extLst>
                     </a:blip>
@@ -4770,7 +4649,31 @@
         <w:rPr>
           <w:lang w:val="es-419" w:eastAsia="es-CO"/>
         </w:rPr>
-        <w:t>Esta cuenta empieza y aumenta en él Debe, y se disminuye y cancela en el haber. Por lo general no se acredita, su saldo es débito.</w:t>
+        <w:t>Esta cuenta empieza y aumenta en él Debe, y se disminuye y cancela en el haber. Por lo general</w:t>
+      </w:r>
+      <w:r>
+        <w:rPr>
+          <w:lang w:val="es-419" w:eastAsia="es-CO"/>
+        </w:rPr>
+        <w:t>.</w:t>
+      </w:r>
+      <w:r>
+        <w:rPr>
+          <w:lang w:val="es-419" w:eastAsia="es-CO"/>
+        </w:rPr>
+        <w:t xml:space="preserve"> no se acredita</w:t>
+      </w:r>
+      <w:r>
+        <w:rPr>
+          <w:lang w:val="es-419" w:eastAsia="es-CO"/>
+        </w:rPr>
+        <w:t>;</w:t>
+      </w:r>
+      <w:r>
+        <w:rPr>
+          <w:lang w:val="es-419" w:eastAsia="es-CO"/>
+        </w:rPr>
+        <w:t xml:space="preserve"> su saldo es débito.</w:t>
       </w:r>
     </w:p>
     <w:p>
@@ -4798,6 +4701,7 @@
           <w:noProof/>
           <w:lang w:val="es-419" w:eastAsia="es-CO"/>
         </w:rPr>
+        <w:lastRenderedPageBreak/>
         <w:drawing>
           <wp:inline distT="0" distB="0" distL="0" distR="0" wp14:anchorId="631F4F66" wp14:editId="780E79DC">
             <wp:extent cx="5028150" cy="2090262"/>
@@ -4814,13 +4718,13 @@
                     <pic:cNvPicPr/>
                   </pic:nvPicPr>
                   <pic:blipFill>
-                    <a:blip r:embed="rId18">
+                    <a:blip r:embed="rId16">
                       <a:extLst>
                         <a:ext uri="{28A0092B-C50C-407E-A947-70E740481C1C}">
                           <a14:useLocalDpi xmlns:a14="http://schemas.microsoft.com/office/drawing/2010/main" val="0"/>
                         </a:ext>
                         <a:ext uri="{96DAC541-7B7A-43D3-8B79-37D633B846F1}">
-                          <asvg:svgBlip xmlns:asvg="http://schemas.microsoft.com/office/drawing/2016/SVG/main" r:embed="rId19"/>
+                          <asvg:svgBlip xmlns:asvg="http://schemas.microsoft.com/office/drawing/2016/SVG/main" r:embed="rId17"/>
                         </a:ext>
                       </a:extLst>
                     </a:blip>
@@ -4850,7 +4754,6 @@
       </w:pPr>
       <w:bookmarkStart w:id="5" w:name="_Toc224305676"/>
       <w:r>
-        <w:lastRenderedPageBreak/>
         <w:t>Cuentas de orden</w:t>
       </w:r>
       <w:bookmarkEnd w:id="5"/>
@@ -4865,7 +4768,43 @@
         <w:rPr>
           <w:lang w:val="es-419" w:eastAsia="es-CO"/>
         </w:rPr>
-        <w:t>En Colombia las cuentas de orden son registros contables que se utilizan para controlar circunstancias, que no afectan directamente e inmediata el balance general ni el estado de resultados, pero sí a futuro. Se utilizan para control interno y dar información. Se registran en la clase 8 y 9.</w:t>
+        <w:t>En Colombia</w:t>
+      </w:r>
+      <w:r>
+        <w:rPr>
+          <w:lang w:val="es-419" w:eastAsia="es-CO"/>
+        </w:rPr>
+        <w:t>,</w:t>
+      </w:r>
+      <w:r>
+        <w:rPr>
+          <w:lang w:val="es-419" w:eastAsia="es-CO"/>
+        </w:rPr>
+        <w:t xml:space="preserve"> las cuentas de orden son registros contables que se utilizan para controlar circunstancias que no afectan directamente e inmediata</w:t>
+      </w:r>
+      <w:r>
+        <w:rPr>
+          <w:lang w:val="es-419" w:eastAsia="es-CO"/>
+        </w:rPr>
+        <w:t>mente</w:t>
+      </w:r>
+      <w:r>
+        <w:rPr>
+          <w:lang w:val="es-419" w:eastAsia="es-CO"/>
+        </w:rPr>
+        <w:t xml:space="preserve"> el balance general ni el estado de resultados, pero sí a futuro. Se utilizan para control interno y dar información. Se registran en </w:t>
+      </w:r>
+      <w:r>
+        <w:rPr>
+          <w:lang w:val="es-419" w:eastAsia="es-CO"/>
+        </w:rPr>
+        <w:t>las clases</w:t>
+      </w:r>
+      <w:r>
+        <w:rPr>
+          <w:lang w:val="es-419" w:eastAsia="es-CO"/>
+        </w:rPr>
+        <w:t xml:space="preserve"> 8 y 9.</w:t>
       </w:r>
     </w:p>
     <w:p>
@@ -4916,7 +4855,19 @@
         <w:rPr>
           <w:lang w:val="es-419" w:eastAsia="es-CO"/>
         </w:rPr>
-        <w:t xml:space="preserve"> Los dineros, los documentos y los bienes que conforman el grupo de cuentas de orden deudoras se manejan como las cuentas de activo, por lo tanto, su saldo es débito. Ejemplo: bienes y valores entregados en custodia o en garantía.</w:t>
+        <w:t xml:space="preserve"> Los dineros, los documentos y los bienes que conforman el grupo de cuentas de orden deudoras se manejan como las cuentas de activo</w:t>
+      </w:r>
+      <w:r>
+        <w:rPr>
+          <w:lang w:val="es-419" w:eastAsia="es-CO"/>
+        </w:rPr>
+        <w:t>;</w:t>
+      </w:r>
+      <w:r>
+        <w:rPr>
+          <w:lang w:val="es-419" w:eastAsia="es-CO"/>
+        </w:rPr>
+        <w:t xml:space="preserve"> por lo tanto, su saldo es débito. Ejemplo: bienes y valores entregados en custodia o en garantía.</w:t>
       </w:r>
     </w:p>
     <w:p>
@@ -4998,52 +4949,52 @@
       </w:pPr>
       <w:bookmarkStart w:id="6" w:name="_Toc224305677"/>
       <w:r>
+        <w:t>Registros contables</w:t>
+      </w:r>
+      <w:bookmarkEnd w:id="6"/>
+    </w:p>
+    <w:p>
+      <w:pPr>
+        <w:rPr>
+          <w:lang w:val="es-419" w:eastAsia="es-CO"/>
+        </w:rPr>
+      </w:pPr>
+      <w:r>
+        <w:rPr>
+          <w:lang w:val="es-419" w:eastAsia="es-CO"/>
+        </w:rPr>
+        <w:t>Los registros contables se fundamentan en una organización financiera estructurada que comienza con la recolección sistemática de información dentro del proceso de una organización. Al identificar y clasificar las cuentas en reales, nominales y de resultado, se facilita el dominio de la técnica de registro bajo el concepto de partida doble, esencial para su aplicación en ejercicios prácticos. Este aprendizaje permite a las personas analizar y planear sus propios ingresos, gastos y costos, brindándoles las herramientas necesarias para medir su situación financiera personal y trasladar con éxito ese conocimiento básico al ámbito empresarial.</w:t>
+      </w:r>
+    </w:p>
+    <w:p>
+      <w:pPr>
+        <w:pStyle w:val="Ttulo2"/>
+      </w:pPr>
+      <w:bookmarkStart w:id="7" w:name="_Toc224305678"/>
+      <w:r>
+        <w:t>Partida doble</w:t>
+      </w:r>
+      <w:bookmarkEnd w:id="7"/>
+    </w:p>
+    <w:p>
+      <w:pPr>
+        <w:rPr>
+          <w:lang w:val="es-419" w:eastAsia="es-CO"/>
+        </w:rPr>
+      </w:pPr>
+      <w:r>
+        <w:rPr>
+          <w:lang w:val="es-419" w:eastAsia="es-CO"/>
+        </w:rPr>
+        <w:t>Es el método más utilizado para el registro de las operaciones contables. Cada operación debe registrarse dos veces, una en “debe” y otra en “haber”. Esto es similar a una balanza en equilibrio porque la suma de los registros en el “debe” y el “haber” debe coincidir. Para interiorizar estos conceptos realizaremos algunos ejemplos:</w:t>
+      </w:r>
+    </w:p>
+    <w:p>
+      <w:pPr>
+        <w:pStyle w:val="Ttulo5"/>
+      </w:pPr>
+      <w:r>
         <w:lastRenderedPageBreak/>
-        <w:t>Registros contables</w:t>
-      </w:r>
-      <w:bookmarkEnd w:id="6"/>
-    </w:p>
-    <w:p>
-      <w:pPr>
-        <w:rPr>
-          <w:lang w:val="es-419" w:eastAsia="es-CO"/>
-        </w:rPr>
-      </w:pPr>
-      <w:r>
-        <w:rPr>
-          <w:lang w:val="es-419" w:eastAsia="es-CO"/>
-        </w:rPr>
-        <w:t>Los registros contables se fundamentan en una organización financiera estructurada que comienza con la recolección sistemática de información dentro del proceso de una organización. Al identificar y clasificar las cuentas en reales, nominales y de resultado, se facilita el dominio de la técnica de registro bajo el concepto de partida doble, esencial para su aplicación en ejercicios prácticos. Este aprendizaje permite a las personas analizar y planear sus propios ingresos, gastos y costos, brindándoles las herramientas necesarias para medir su situación financiera personal y trasladar con éxito ese conocimiento básico al ámbito empresarial.</w:t>
-      </w:r>
-    </w:p>
-    <w:p>
-      <w:pPr>
-        <w:pStyle w:val="Ttulo2"/>
-      </w:pPr>
-      <w:bookmarkStart w:id="7" w:name="_Toc224305678"/>
-      <w:r>
-        <w:t>Partida doble</w:t>
-      </w:r>
-      <w:bookmarkEnd w:id="7"/>
-    </w:p>
-    <w:p>
-      <w:pPr>
-        <w:rPr>
-          <w:lang w:val="es-419" w:eastAsia="es-CO"/>
-        </w:rPr>
-      </w:pPr>
-      <w:r>
-        <w:rPr>
-          <w:lang w:val="es-419" w:eastAsia="es-CO"/>
-        </w:rPr>
-        <w:t>Es el método más utilizado para el registro de las operaciones contables. Cada operación debe registrarse dos veces, una en “debe” y otra en “haber”. Esto es similar a una balanza en equilibrio porque la suma de los registros en el “debe” y el “haber” debe coincidir. Para interiorizar estos conceptos realizaremos algunos ejemplos:</w:t>
-      </w:r>
-    </w:p>
-    <w:p>
-      <w:pPr>
-        <w:pStyle w:val="Ttulo5"/>
-      </w:pPr>
-      <w:r>
         <w:t>Ejemplo 1</w:t>
       </w:r>
     </w:p>
@@ -5070,7 +5021,19 @@
         <w:rPr>
           <w:lang w:val="es-419" w:eastAsia="es-CO"/>
         </w:rPr>
-        <w:t>Cuando se vende al contado se recibe dinero, por lo que la cuenta de activos Caja aumenta, y por tanto se debita.</w:t>
+        <w:t>Cuando se vende al contado</w:t>
+      </w:r>
+      <w:r>
+        <w:rPr>
+          <w:lang w:val="es-419" w:eastAsia="es-CO"/>
+        </w:rPr>
+        <w:t>,</w:t>
+      </w:r>
+      <w:r>
+        <w:rPr>
+          <w:lang w:val="es-419" w:eastAsia="es-CO"/>
+        </w:rPr>
+        <w:t xml:space="preserve"> se recibe dinero, por lo que la cuenta de activos Caja aumenta, y por tanto se debita.</w:t>
       </w:r>
     </w:p>
     <w:p>
@@ -5098,7 +5061,6 @@
         <w:pStyle w:val="Figura"/>
       </w:pPr>
       <w:r>
-        <w:lastRenderedPageBreak/>
         <w:t>Registros</w:t>
       </w:r>
     </w:p>
@@ -5126,6 +5088,137 @@
                 <pic:pic xmlns:pic="http://schemas.openxmlformats.org/drawingml/2006/picture">
                   <pic:nvPicPr>
                     <pic:cNvPr id="5" name="Gráfico 5" descr="las imágenes representan en forma de cuenta T los registros realizados. Primero en la cuenta 1105 - Caja, donde se ubican en el “debe” el valor de $7.400.000 por la venta al contado del terreno y en contrapartida, en la cuenta 1504 - Terrenos, se ubicado en el “haber” los $7.400.000 porque disminuye el valor de los terrenos. "/>
+                    <pic:cNvPicPr/>
+                  </pic:nvPicPr>
+                  <pic:blipFill>
+                    <a:blip r:embed="rId18">
+                      <a:extLst>
+                        <a:ext uri="{28A0092B-C50C-407E-A947-70E740481C1C}">
+                          <a14:useLocalDpi xmlns:a14="http://schemas.microsoft.com/office/drawing/2010/main" val="0"/>
+                        </a:ext>
+                        <a:ext uri="{96DAC541-7B7A-43D3-8B79-37D633B846F1}">
+                          <asvg:svgBlip xmlns:asvg="http://schemas.microsoft.com/office/drawing/2016/SVG/main" r:embed="rId19"/>
+                        </a:ext>
+                      </a:extLst>
+                    </a:blip>
+                    <a:stretch>
+                      <a:fillRect/>
+                    </a:stretch>
+                  </pic:blipFill>
+                  <pic:spPr>
+                    <a:xfrm>
+                      <a:off x="0" y="0"/>
+                      <a:ext cx="5495925" cy="1971675"/>
+                    </a:xfrm>
+                    <a:prstGeom prst="rect">
+                      <a:avLst/>
+                    </a:prstGeom>
+                  </pic:spPr>
+                </pic:pic>
+              </a:graphicData>
+            </a:graphic>
+          </wp:inline>
+        </w:drawing>
+      </w:r>
+    </w:p>
+    <w:p>
+      <w:pPr>
+        <w:pStyle w:val="Ttulo5"/>
+      </w:pPr>
+      <w:r>
+        <w:t>Ejemplo 2</w:t>
+      </w:r>
+    </w:p>
+    <w:p>
+      <w:pPr>
+        <w:rPr>
+          <w:lang w:val="es-419" w:eastAsia="es-CO"/>
+        </w:rPr>
+      </w:pPr>
+      <w:r>
+        <w:rPr>
+          <w:lang w:val="es-419" w:eastAsia="es-CO"/>
+        </w:rPr>
+        <w:t>Una empresa realiza una compra de mercancías a crédito por $900.000. La cuenta de costo, denominada compra de mercancías</w:t>
+      </w:r>
+      <w:r>
+        <w:rPr>
+          <w:lang w:val="es-419" w:eastAsia="es-CO"/>
+        </w:rPr>
+        <w:t>,</w:t>
+      </w:r>
+      <w:r>
+        <w:rPr>
+          <w:lang w:val="es-419" w:eastAsia="es-CO"/>
+        </w:rPr>
+        <w:t xml:space="preserve"> aumenta, y por tanto se debita.</w:t>
+      </w:r>
+    </w:p>
+    <w:p>
+      <w:pPr>
+        <w:rPr>
+          <w:lang w:val="es-419" w:eastAsia="es-CO"/>
+        </w:rPr>
+      </w:pPr>
+      <w:r>
+        <w:rPr>
+          <w:lang w:val="es-419" w:eastAsia="es-CO"/>
+        </w:rPr>
+        <w:t>Cuando se recibe la mercancía</w:t>
+      </w:r>
+      <w:r>
+        <w:rPr>
+          <w:lang w:val="es-419" w:eastAsia="es-CO"/>
+        </w:rPr>
+        <w:t>,</w:t>
+      </w:r>
+      <w:r>
+        <w:rPr>
+          <w:lang w:val="es-419" w:eastAsia="es-CO"/>
+        </w:rPr>
+        <w:t xml:space="preserve"> se debe pagar su valor, pero como fue comprada a crédito, las deudas aumentan, por lo que la cuenta de pasivo llamada proveedores nacionales se acredita.</w:t>
+      </w:r>
+    </w:p>
+    <w:p>
+      <w:pPr>
+        <w:pStyle w:val="Figura"/>
+        <w:rPr>
+          <w:lang w:val="es-419"/>
+        </w:rPr>
+      </w:pPr>
+      <w:r>
+        <w:rPr>
+          <w:lang w:val="es-419"/>
+        </w:rPr>
+        <w:lastRenderedPageBreak/>
+        <w:t>Registros</w:t>
+      </w:r>
+    </w:p>
+    <w:p>
+      <w:pPr>
+        <w:ind w:left="284" w:firstLine="0"/>
+        <w:rPr>
+          <w:lang w:val="es-419" w:eastAsia="es-CO"/>
+        </w:rPr>
+      </w:pPr>
+      <w:r>
+        <w:rPr>
+          <w:noProof/>
+          <w:lang w:val="es-419" w:eastAsia="es-CO"/>
+        </w:rPr>
+        <w:drawing>
+          <wp:inline distT="0" distB="0" distL="0" distR="0" wp14:anchorId="142A24D1" wp14:editId="29B9598A">
+            <wp:extent cx="5495925" cy="1971675"/>
+            <wp:effectExtent l="0" t="0" r="9525" b="9525"/>
+            <wp:docPr id="7" name="Gráfico 7" descr="las imágenes representan en forma de cuenta T los registros realizados. Primero en la cuenta 6205 - Compra de mercancía, donde se ubican en el “debe” el valor de $900.000 por la adquisición de mercancía y en contrapartida, en la cuenta 2205 -Proveedores nacionales, se ubicado en el “haber” los $900.000 porque la compra se realizó a crédito."/>
+            <wp:cNvGraphicFramePr>
+              <a:graphicFrameLocks xmlns:a="http://schemas.openxmlformats.org/drawingml/2006/main" noChangeAspect="1"/>
+            </wp:cNvGraphicFramePr>
+            <a:graphic xmlns:a="http://schemas.openxmlformats.org/drawingml/2006/main">
+              <a:graphicData uri="http://schemas.openxmlformats.org/drawingml/2006/picture">
+                <pic:pic xmlns:pic="http://schemas.openxmlformats.org/drawingml/2006/picture">
+                  <pic:nvPicPr>
+                    <pic:cNvPr id="7" name="Gráfico 7" descr="las imágenes representan en forma de cuenta T los registros realizados. Primero en la cuenta 6205 - Compra de mercancía, donde se ubican en el “debe” el valor de $900.000 por la adquisición de mercancía y en contrapartida, en la cuenta 2205 -Proveedores nacionales, se ubicado en el “haber” los $900.000 porque la compra se realizó a crédito."/>
                     <pic:cNvPicPr/>
                   </pic:nvPicPr>
                   <pic:blipFill>
@@ -5161,36 +5254,72 @@
     </w:p>
     <w:p>
       <w:pPr>
+        <w:pStyle w:val="Ttulo2"/>
+      </w:pPr>
+      <w:bookmarkStart w:id="8" w:name="_Toc224305679"/>
+      <w:r>
+        <w:t>Asientos contables</w:t>
+      </w:r>
+      <w:bookmarkEnd w:id="8"/>
+    </w:p>
+    <w:p>
+      <w:pPr>
+        <w:rPr>
+          <w:lang w:val="es-419" w:eastAsia="es-CO"/>
+        </w:rPr>
+      </w:pPr>
+      <w:r>
+        <w:rPr>
+          <w:lang w:val="es-419" w:eastAsia="es-CO"/>
+        </w:rPr>
+        <w:t>Un asiento contable es el registro de las operaciones mercantiles en los comprobantes y libros de contabilidad. Existen dos tipos de asientos:</w:t>
+      </w:r>
+    </w:p>
+    <w:p>
+      <w:pPr>
         <w:pStyle w:val="Ttulo5"/>
       </w:pPr>
       <w:r>
-        <w:t>Ejemplo 2</w:t>
-      </w:r>
-    </w:p>
-    <w:p>
-      <w:pPr>
-        <w:rPr>
-          <w:lang w:val="es-419" w:eastAsia="es-CO"/>
-        </w:rPr>
-      </w:pPr>
-      <w:r>
-        <w:rPr>
-          <w:lang w:val="es-419" w:eastAsia="es-CO"/>
-        </w:rPr>
-        <w:t>Una empresa realiza una compra de mercancías a crédito por $900.000. La cuenta de costo, denominada compra de mercancías aumenta, y por tanto se debita.</w:t>
-      </w:r>
-    </w:p>
-    <w:p>
-      <w:pPr>
-        <w:rPr>
-          <w:lang w:val="es-419" w:eastAsia="es-CO"/>
-        </w:rPr>
-      </w:pPr>
-      <w:r>
-        <w:rPr>
-          <w:lang w:val="es-419" w:eastAsia="es-CO"/>
-        </w:rPr>
-        <w:t>Cuando se recibe la mercancía se debe pagar su valor, pero como fue comprada a crédito, las deudas aumentan, por lo que la cuenta de pasivo llamada proveedores nacionales se acredita.</w:t>
+        <w:t>Asiento simple</w:t>
+      </w:r>
+    </w:p>
+    <w:p>
+      <w:pPr>
+        <w:rPr>
+          <w:lang w:val="es-419" w:eastAsia="es-CO"/>
+        </w:rPr>
+      </w:pPr>
+      <w:r>
+        <w:rPr>
+          <w:lang w:val="es-419" w:eastAsia="es-CO"/>
+        </w:rPr>
+        <w:t>Este registro se presenta cuando solo son afectadas dos cuentas: un débito y un crédito.</w:t>
+      </w:r>
+    </w:p>
+    <w:p>
+      <w:pPr>
+        <w:rPr>
+          <w:lang w:val="es-419" w:eastAsia="es-CO"/>
+        </w:rPr>
+      </w:pPr>
+      <w:r>
+        <w:rPr>
+          <w:lang w:val="es-419" w:eastAsia="es-CO"/>
+        </w:rPr>
+        <w:t>Ejemplo:</w:t>
+      </w:r>
+    </w:p>
+    <w:p>
+      <w:pPr>
+        <w:rPr>
+          <w:lang w:val="es-419" w:eastAsia="es-CO"/>
+        </w:rPr>
+      </w:pPr>
+      <w:r>
+        <w:rPr>
+          <w:lang w:val="es-419" w:eastAsia="es-CO"/>
+        </w:rPr>
+        <w:t>Se compra al contado, con cheque, un teléfono para uso de la empresa por $300.000.</w:t>
       </w:r>
     </w:p>
     <w:p>
@@ -5204,12 +5333,11 @@
         <w:rPr>
           <w:lang w:val="es-419"/>
         </w:rPr>
-        <w:t>Registros</w:t>
-      </w:r>
-    </w:p>
-    <w:p>
-      <w:pPr>
-        <w:ind w:left="284" w:firstLine="0"/>
+        <w:t>Registro</w:t>
+      </w:r>
+    </w:p>
+    <w:p>
+      <w:pPr>
         <w:rPr>
           <w:lang w:val="es-419" w:eastAsia="es-CO"/>
         </w:rPr>
@@ -5219,148 +5347,7 @@
           <w:noProof/>
           <w:lang w:val="es-419" w:eastAsia="es-CO"/>
         </w:rPr>
-        <w:drawing>
-          <wp:inline distT="0" distB="0" distL="0" distR="0" wp14:anchorId="142A24D1" wp14:editId="29B9598A">
-            <wp:extent cx="5495925" cy="1971675"/>
-            <wp:effectExtent l="0" t="0" r="9525" b="9525"/>
-            <wp:docPr id="7" name="Gráfico 7" descr="las imágenes representan en forma de cuenta T los registros realizados. Primero en la cuenta 6205 - Compra de mercancía, donde se ubican en el “debe” el valor de $900.000 por la adquisición de mercancía y en contrapartida, en la cuenta 2205 -Proveedores nacionales, se ubicado en el “haber” los $900.000 porque la compra se realizó a crédito."/>
-            <wp:cNvGraphicFramePr>
-              <a:graphicFrameLocks xmlns:a="http://schemas.openxmlformats.org/drawingml/2006/main" noChangeAspect="1"/>
-            </wp:cNvGraphicFramePr>
-            <a:graphic xmlns:a="http://schemas.openxmlformats.org/drawingml/2006/main">
-              <a:graphicData uri="http://schemas.openxmlformats.org/drawingml/2006/picture">
-                <pic:pic xmlns:pic="http://schemas.openxmlformats.org/drawingml/2006/picture">
-                  <pic:nvPicPr>
-                    <pic:cNvPr id="7" name="Gráfico 7" descr="las imágenes representan en forma de cuenta T los registros realizados. Primero en la cuenta 6205 - Compra de mercancía, donde se ubican en el “debe” el valor de $900.000 por la adquisición de mercancía y en contrapartida, en la cuenta 2205 -Proveedores nacionales, se ubicado en el “haber” los $900.000 porque la compra se realizó a crédito."/>
-                    <pic:cNvPicPr/>
-                  </pic:nvPicPr>
-                  <pic:blipFill>
-                    <a:blip r:embed="rId22">
-                      <a:extLst>
-                        <a:ext uri="{28A0092B-C50C-407E-A947-70E740481C1C}">
-                          <a14:useLocalDpi xmlns:a14="http://schemas.microsoft.com/office/drawing/2010/main" val="0"/>
-                        </a:ext>
-                        <a:ext uri="{96DAC541-7B7A-43D3-8B79-37D633B846F1}">
-                          <asvg:svgBlip xmlns:asvg="http://schemas.microsoft.com/office/drawing/2016/SVG/main" r:embed="rId23"/>
-                        </a:ext>
-                      </a:extLst>
-                    </a:blip>
-                    <a:stretch>
-                      <a:fillRect/>
-                    </a:stretch>
-                  </pic:blipFill>
-                  <pic:spPr>
-                    <a:xfrm>
-                      <a:off x="0" y="0"/>
-                      <a:ext cx="5495925" cy="1971675"/>
-                    </a:xfrm>
-                    <a:prstGeom prst="rect">
-                      <a:avLst/>
-                    </a:prstGeom>
-                  </pic:spPr>
-                </pic:pic>
-              </a:graphicData>
-            </a:graphic>
-          </wp:inline>
-        </w:drawing>
-      </w:r>
-    </w:p>
-    <w:p>
-      <w:pPr>
-        <w:pStyle w:val="Ttulo2"/>
-      </w:pPr>
-      <w:bookmarkStart w:id="8" w:name="_Toc224305679"/>
-      <w:r>
         <w:lastRenderedPageBreak/>
-        <w:t>Asientos contables</w:t>
-      </w:r>
-      <w:bookmarkEnd w:id="8"/>
-    </w:p>
-    <w:p>
-      <w:pPr>
-        <w:rPr>
-          <w:lang w:val="es-419" w:eastAsia="es-CO"/>
-        </w:rPr>
-      </w:pPr>
-      <w:r>
-        <w:rPr>
-          <w:lang w:val="es-419" w:eastAsia="es-CO"/>
-        </w:rPr>
-        <w:t>Un asiento contable es el registro de las operaciones mercantiles en los comprobantes y libros de contabilidad. Existen dos tipos de asientos:</w:t>
-      </w:r>
-    </w:p>
-    <w:p>
-      <w:pPr>
-        <w:pStyle w:val="Ttulo5"/>
-      </w:pPr>
-      <w:r>
-        <w:t>Asiento simple</w:t>
-      </w:r>
-    </w:p>
-    <w:p>
-      <w:pPr>
-        <w:rPr>
-          <w:lang w:val="es-419" w:eastAsia="es-CO"/>
-        </w:rPr>
-      </w:pPr>
-      <w:r>
-        <w:rPr>
-          <w:lang w:val="es-419" w:eastAsia="es-CO"/>
-        </w:rPr>
-        <w:t>Este registro se presenta cuando solo son afectadas dos cuentas: un débito y un crédito.</w:t>
-      </w:r>
-    </w:p>
-    <w:p>
-      <w:pPr>
-        <w:rPr>
-          <w:lang w:val="es-419" w:eastAsia="es-CO"/>
-        </w:rPr>
-      </w:pPr>
-      <w:r>
-        <w:rPr>
-          <w:lang w:val="es-419" w:eastAsia="es-CO"/>
-        </w:rPr>
-        <w:t>Ejemplo:</w:t>
-      </w:r>
-    </w:p>
-    <w:p>
-      <w:pPr>
-        <w:rPr>
-          <w:lang w:val="es-419" w:eastAsia="es-CO"/>
-        </w:rPr>
-      </w:pPr>
-      <w:r>
-        <w:rPr>
-          <w:lang w:val="es-419" w:eastAsia="es-CO"/>
-        </w:rPr>
-        <w:t>Se compra al contado, con cheque, un teléfono para uso de la empresa por $300.000.</w:t>
-      </w:r>
-    </w:p>
-    <w:p>
-      <w:pPr>
-        <w:pStyle w:val="Figura"/>
-        <w:rPr>
-          <w:lang w:val="es-419"/>
-        </w:rPr>
-      </w:pPr>
-      <w:r>
-        <w:rPr>
-          <w:lang w:val="es-419"/>
-        </w:rPr>
-        <w:t>Registro</w:t>
-      </w:r>
-    </w:p>
-    <w:p>
-      <w:pPr>
-        <w:rPr>
-          <w:lang w:val="es-419" w:eastAsia="es-CO"/>
-        </w:rPr>
-      </w:pPr>
-      <w:r>
-        <w:rPr>
-          <w:noProof/>
-          <w:lang w:val="es-419" w:eastAsia="es-CO"/>
-        </w:rPr>
         <w:drawing>
           <wp:inline distT="0" distB="0" distL="0" distR="0" wp14:anchorId="5B19168F" wp14:editId="1EF2C6AE">
             <wp:extent cx="5400675" cy="2257425"/>
@@ -5377,13 +5364,13 @@
                     <pic:cNvPicPr/>
                   </pic:nvPicPr>
                   <pic:blipFill>
-                    <a:blip r:embed="rId24">
+                    <a:blip r:embed="rId22">
                       <a:extLst>
                         <a:ext uri="{28A0092B-C50C-407E-A947-70E740481C1C}">
                           <a14:useLocalDpi xmlns:a14="http://schemas.microsoft.com/office/drawing/2010/main" val="0"/>
                         </a:ext>
                         <a:ext uri="{96DAC541-7B7A-43D3-8B79-37D633B846F1}">
-                          <asvg:svgBlip xmlns:asvg="http://schemas.microsoft.com/office/drawing/2016/SVG/main" r:embed="rId25"/>
+                          <asvg:svgBlip xmlns:asvg="http://schemas.microsoft.com/office/drawing/2016/SVG/main" r:embed="rId23"/>
                         </a:ext>
                       </a:extLst>
                     </a:blip>
@@ -5448,51 +5435,51 @@
         <w:rPr>
           <w:lang w:val="es-419" w:eastAsia="es-CO"/>
         </w:rPr>
+        <w:t>Ejemplo:</w:t>
+      </w:r>
+    </w:p>
+    <w:p>
+      <w:pPr>
+        <w:ind w:left="284" w:firstLine="0"/>
+        <w:rPr>
+          <w:lang w:val="es-419" w:eastAsia="es-CO"/>
+        </w:rPr>
+      </w:pPr>
+      <w:r>
+        <w:rPr>
+          <w:lang w:val="es-419" w:eastAsia="es-CO"/>
+        </w:rPr>
+        <w:t>Una empresa vende mercancías por $820.000. Se reciben $200.000 de contado y el saldo a crédito.</w:t>
+      </w:r>
+    </w:p>
+    <w:p>
+      <w:pPr>
+        <w:pStyle w:val="Figura"/>
+        <w:rPr>
+          <w:lang w:val="es-419"/>
+        </w:rPr>
+      </w:pPr>
+      <w:r>
+        <w:rPr>
+          <w:lang w:val="es-419"/>
+        </w:rPr>
+        <w:t>Registro</w:t>
+      </w:r>
+    </w:p>
+    <w:p>
+      <w:pPr>
+        <w:ind w:left="284" w:firstLine="0"/>
+        <w:rPr>
+          <w:noProof/>
+          <w:lang w:val="es-419" w:eastAsia="es-CO"/>
+        </w:rPr>
+      </w:pPr>
+      <w:r>
+        <w:rPr>
+          <w:noProof/>
+          <w:lang w:val="es-419" w:eastAsia="es-CO"/>
+        </w:rPr>
         <w:lastRenderedPageBreak/>
-        <w:t>Ejemplo:</w:t>
-      </w:r>
-    </w:p>
-    <w:p>
-      <w:pPr>
-        <w:ind w:left="284" w:firstLine="0"/>
-        <w:rPr>
-          <w:lang w:val="es-419" w:eastAsia="es-CO"/>
-        </w:rPr>
-      </w:pPr>
-      <w:r>
-        <w:rPr>
-          <w:lang w:val="es-419" w:eastAsia="es-CO"/>
-        </w:rPr>
-        <w:t>Una empresa vende mercancías por $820.000. Se reciben $200.000 de contado y el saldo a crédito.</w:t>
-      </w:r>
-    </w:p>
-    <w:p>
-      <w:pPr>
-        <w:pStyle w:val="Figura"/>
-        <w:rPr>
-          <w:lang w:val="es-419"/>
-        </w:rPr>
-      </w:pPr>
-      <w:r>
-        <w:rPr>
-          <w:lang w:val="es-419"/>
-        </w:rPr>
-        <w:t>Registro</w:t>
-      </w:r>
-    </w:p>
-    <w:p>
-      <w:pPr>
-        <w:ind w:left="284" w:firstLine="0"/>
-        <w:rPr>
-          <w:noProof/>
-          <w:lang w:val="es-419" w:eastAsia="es-CO"/>
-        </w:rPr>
-      </w:pPr>
-      <w:r>
-        <w:rPr>
-          <w:noProof/>
-          <w:lang w:val="es-419" w:eastAsia="es-CO"/>
-        </w:rPr>
         <w:drawing>
           <wp:inline distT="0" distB="0" distL="0" distR="0" wp14:anchorId="19E98E73" wp14:editId="29F766FB">
             <wp:extent cx="5810250" cy="2171700"/>
@@ -5509,13 +5496,13 @@
                     <pic:cNvPicPr/>
                   </pic:nvPicPr>
                   <pic:blipFill>
-                    <a:blip r:embed="rId26">
+                    <a:blip r:embed="rId24">
                       <a:extLst>
                         <a:ext uri="{28A0092B-C50C-407E-A947-70E740481C1C}">
                           <a14:useLocalDpi xmlns:a14="http://schemas.microsoft.com/office/drawing/2010/main" val="0"/>
                         </a:ext>
                         <a:ext uri="{96DAC541-7B7A-43D3-8B79-37D633B846F1}">
-                          <asvg:svgBlip xmlns:asvg="http://schemas.microsoft.com/office/drawing/2016/SVG/main" r:embed="rId27"/>
+                          <asvg:svgBlip xmlns:asvg="http://schemas.microsoft.com/office/drawing/2016/SVG/main" r:embed="rId25"/>
                         </a:ext>
                       </a:extLst>
                     </a:blip>
@@ -5549,7 +5536,19 @@
         <w:rPr>
           <w:lang w:val="es-419" w:eastAsia="es-CO"/>
         </w:rPr>
-        <w:t>Para registrar las operaciones mercantiles en los comprobantes y libros de contabilidad se cambia la estructura de la cuenta T por los asientos de diario, de forma horizontal.</w:t>
+        <w:t>Para registrar las operaciones mercantiles en los comprobantes y libros de contabilidad</w:t>
+      </w:r>
+      <w:r>
+        <w:rPr>
+          <w:lang w:val="es-419" w:eastAsia="es-CO"/>
+        </w:rPr>
+        <w:t>,</w:t>
+      </w:r>
+      <w:r>
+        <w:rPr>
+          <w:lang w:val="es-419" w:eastAsia="es-CO"/>
+        </w:rPr>
+        <w:t xml:space="preserve"> se cambia la estructura de la cuenta T por los asientos de diario, de forma horizontal.</w:t>
       </w:r>
     </w:p>
     <w:p>
@@ -5936,14 +5935,14 @@
         <w:rPr>
           <w:lang w:val="es-419" w:eastAsia="es-CO"/>
         </w:rPr>
-        <w:t xml:space="preserve">En la presente sección se desarrollará una serie de ejercicios prácticos diseñados para fortalecer la comprensión del ciclo contable y la correcta aplicación del principio </w:t>
+        <w:t xml:space="preserve">En la presente sección se desarrollará una serie de ejercicios prácticos diseñados para fortalecer la comprensión del ciclo contable y la correcta aplicación del principio de devengo. A través de estos casos, se abordará el registro de transacciones de gastos e ingresos en sus diversas modalidades, incluyendo el tratamiento técnico de los gastos pagados por anticipado y los ingresos recibidos por adelantado. Asimismo, se profundizará en el reconocimiento de gastos causados por pagar, culminando el </w:t>
       </w:r>
       <w:r>
         <w:rPr>
           <w:lang w:val="es-419" w:eastAsia="es-CO"/>
         </w:rPr>
         <w:lastRenderedPageBreak/>
-        <w:t>de devengo. A través de estos casos, se abordará el registro de transacciones de gastos e ingresos en sus diversas modalidades, incluyendo el tratamiento técnico de los gastos pagados por anticipado y los ingresos recibidos por adelantado. Asimismo, se profundizará en el reconocimiento de gastos causados por pagar, culminando el proceso con la comprobación de saldos para garantizar la integridad y el equilibrio de las cifras financieras presentadas.</w:t>
+        <w:t>proceso con la comprobación de saldos para garantizar la integridad y el equilibrio de las cifras financieras presentadas.</w:t>
       </w:r>
     </w:p>
     <w:p>
@@ -6588,6 +6587,7 @@
               <w:pStyle w:val="TextoTablas"/>
             </w:pPr>
             <w:r>
+              <w:lastRenderedPageBreak/>
               <w:t>Código</w:t>
             </w:r>
           </w:p>
@@ -7164,7 +7164,6 @@
         <w:rPr>
           <w:lang w:val="es-419" w:eastAsia="es-CO"/>
         </w:rPr>
-        <w:lastRenderedPageBreak/>
         <w:t>Asiento de gastos causados por pagar</w:t>
       </w:r>
     </w:p>
@@ -7745,7 +7744,55 @@
         <w:rPr>
           <w:lang w:val="es-419" w:eastAsia="es-CO"/>
         </w:rPr>
-        <w:t>Al terminar el registro de los asientos contables se debe comprobar la aplicación de la partida doble; para esto se debe, en primer lugar, desarrollar el ejercicio en una sola cuenta T al final, se suman los débitos y créditos, los cuales debe dar sumas iguales.</w:t>
+        <w:t>Al terminar el registro de los asientos contables</w:t>
+      </w:r>
+      <w:r>
+        <w:rPr>
+          <w:lang w:val="es-419" w:eastAsia="es-CO"/>
+        </w:rPr>
+        <w:t>,</w:t>
+      </w:r>
+      <w:r>
+        <w:rPr>
+          <w:lang w:val="es-419" w:eastAsia="es-CO"/>
+        </w:rPr>
+        <w:t xml:space="preserve"> se debe comprobar la aplicación de la partida doble; para esto se debe, en primer lugar, desarrollar el ejercicio en una sola cuenta T</w:t>
+      </w:r>
+      <w:r>
+        <w:rPr>
+          <w:lang w:val="es-419" w:eastAsia="es-CO"/>
+        </w:rPr>
+        <w:t>.</w:t>
+      </w:r>
+      <w:r>
+        <w:rPr>
+          <w:lang w:val="es-419" w:eastAsia="es-CO"/>
+        </w:rPr>
+        <w:t xml:space="preserve"> </w:t>
+      </w:r>
+      <w:r>
+        <w:rPr>
+          <w:lang w:val="es-419" w:eastAsia="es-CO"/>
+        </w:rPr>
+        <w:t>A</w:t>
+      </w:r>
+      <w:r>
+        <w:rPr>
+          <w:lang w:val="es-419" w:eastAsia="es-CO"/>
+        </w:rPr>
+        <w:t>l final, se suman los débitos y créditos, los cuales debe</w:t>
+      </w:r>
+      <w:r>
+        <w:rPr>
+          <w:lang w:val="es-419" w:eastAsia="es-CO"/>
+        </w:rPr>
+        <w:t>n</w:t>
+      </w:r>
+      <w:r>
+        <w:rPr>
+          <w:lang w:val="es-419" w:eastAsia="es-CO"/>
+        </w:rPr>
+        <w:t xml:space="preserve"> dar sumas iguales.</w:t>
       </w:r>
     </w:p>
     <w:p>
@@ -7923,7 +7970,6 @@
                 <w:color w:val="12263F"/>
                 <w:szCs w:val="24"/>
               </w:rPr>
-              <w:lastRenderedPageBreak/>
               <w:t>300.000</w:t>
             </w:r>
           </w:p>
@@ -8115,6 +8161,7 @@
                 <w:szCs w:val="24"/>
                 <w:bdr w:val="none" w:sz="0" w:space="0" w:color="auto" w:frame="1"/>
               </w:rPr>
+              <w:lastRenderedPageBreak/>
               <w:t>880.450</w:t>
             </w:r>
           </w:p>
@@ -8162,7 +8209,19 @@
         <w:rPr>
           <w:lang w:val="es-419" w:eastAsia="es-CO"/>
         </w:rPr>
-        <w:t>Es necesario encontrar el equilibrio entre las cuentas reales. Para lograrlo se utiliza una fórmula matemática conocida como la ecuación patrimonial. Esta fórmula revela el valor del activo, pasivo o del patrimonio.</w:t>
+        <w:t>Es necesario encontrar el equilibrio entre las cuentas reales. Para lograrlo</w:t>
+      </w:r>
+      <w:r>
+        <w:rPr>
+          <w:lang w:val="es-419" w:eastAsia="es-CO"/>
+        </w:rPr>
+        <w:t>,</w:t>
+      </w:r>
+      <w:r>
+        <w:rPr>
+          <w:lang w:val="es-419" w:eastAsia="es-CO"/>
+        </w:rPr>
+        <w:t xml:space="preserve"> se utiliza una fórmula matemática conocida como la ecuación patrimonial. Esta fórmula revela el valor del activo, pasivo o del patrimonio.</w:t>
       </w:r>
     </w:p>
     <w:p>
@@ -8400,21 +8459,21 @@
         <w:rPr>
           <w:lang w:val="es-419" w:eastAsia="es-CO"/>
         </w:rPr>
+        <w:t>La información contable suministrada por la empresa se debe registrar en cada una de sus cuentas y para conocer cuál es el valor del patrimonio, las agruparemos por activo, pasivo y patrimonio.</w:t>
+      </w:r>
+    </w:p>
+    <w:p>
+      <w:pPr>
+        <w:pStyle w:val="Tabla"/>
+        <w:rPr>
+          <w:lang w:val="es-419" w:eastAsia="es-CO"/>
+        </w:rPr>
+      </w:pPr>
+      <w:r>
+        <w:rPr>
+          <w:lang w:val="es-419" w:eastAsia="es-CO"/>
+        </w:rPr>
         <w:lastRenderedPageBreak/>
-        <w:t>La información contable suministrada por la empresa se debe registrar en cada una de sus cuentas y para conocer cuál es el valor del patrimonio, las agruparemos por activo, pasivo y patrimonio.</w:t>
-      </w:r>
-    </w:p>
-    <w:p>
-      <w:pPr>
-        <w:pStyle w:val="Tabla"/>
-        <w:rPr>
-          <w:lang w:val="es-419" w:eastAsia="es-CO"/>
-        </w:rPr>
-      </w:pPr>
-      <w:r>
-        <w:rPr>
-          <w:lang w:val="es-419" w:eastAsia="es-CO"/>
-        </w:rPr>
         <w:t>Cuentas del activo</w:t>
       </w:r>
     </w:p>
@@ -8720,7 +8779,19 @@
         <w:rPr>
           <w:lang w:val="es-419" w:eastAsia="es-CO"/>
         </w:rPr>
-        <w:t>Al sumar los valores de cada una de las cuentas del activo se tiene un total de 5.300.000. Para comprender el origen de los recursos externos, se procederá a agrupar las cuentas del pasivo, analizando cada una de las obligaciones y deudas que la entidad ha contraído para financiar su operación.</w:t>
+        <w:t>Al sumar los valores de cada una de las cuentas del activo</w:t>
+      </w:r>
+      <w:r>
+        <w:rPr>
+          <w:lang w:val="es-419" w:eastAsia="es-CO"/>
+        </w:rPr>
+        <w:t>,</w:t>
+      </w:r>
+      <w:r>
+        <w:rPr>
+          <w:lang w:val="es-419" w:eastAsia="es-CO"/>
+        </w:rPr>
+        <w:t xml:space="preserve"> se tiene un total de 5.300.000. Para comprender el origen de los recursos externos, se procederá a agrupar las cuentas del pasivo, analizando cada una de las obligaciones y deudas que la entidad ha contraído para financiar su operación.</w:t>
       </w:r>
     </w:p>
     <w:p>
@@ -8951,8 +9022,19 @@
         <w:rPr>
           <w:lang w:val="es-419" w:eastAsia="es-CO"/>
         </w:rPr>
-        <w:lastRenderedPageBreak/>
-        <w:t>Al sumar los valores de cada una de las cuentas del pasivo se tiene un total de 1.500.000. Al tener los valores del activo y el pasivo, ya se puede determinar el valor del patrimonio, el cual, se puede calcular aplicando la fórmula de ecuación patrimonial así:</w:t>
+        <w:t>Al sumar los valores de cada una de las cuentas del pasivo se tiene un total de 1.500.000. Al tener los valores del activo y el pasivo, ya se puede determinar el valor del patrimonio, el cual</w:t>
+      </w:r>
+      <w:r>
+        <w:rPr>
+          <w:lang w:val="es-419" w:eastAsia="es-CO"/>
+        </w:rPr>
+        <w:t xml:space="preserve"> </w:t>
+      </w:r>
+      <w:r>
+        <w:rPr>
+          <w:lang w:val="es-419" w:eastAsia="es-CO"/>
+        </w:rPr>
+        <w:t>se puede calcular aplicando la fórmula de ecuación patrimonial así:</w:t>
       </w:r>
     </w:p>
     <w:p>
@@ -8992,6 +9074,7 @@
         <w:rPr>
           <w:lang w:val="es-419" w:eastAsia="es-CO"/>
         </w:rPr>
+        <w:lastRenderedPageBreak/>
         <w:t>Aplicando la fórmula de ecuación patrimonial, se puede calcular que el valor del patrimonio es de 3.800.000.</w:t>
       </w:r>
     </w:p>
@@ -9200,14 +9283,31 @@
         <w:rPr>
           <w:lang w:val="es-419" w:eastAsia="es-CO"/>
         </w:rPr>
-        <w:t xml:space="preserve">Al sumar el valor de la cuenta bancos del activo se tiene un total de 3.000.000. Respecto a los pasivos no se realiza ningún registro porque el enunciado del ejercicio </w:t>
-      </w:r>
-      <w:r>
-        <w:rPr>
-          <w:lang w:val="es-419" w:eastAsia="es-CO"/>
-        </w:rPr>
-        <w:lastRenderedPageBreak/>
-        <w:t>únicamente hace referencia a los 3.000.000 en bancos. Finalmente, se tiene el siguiente patrimonio:</w:t>
+        <w:t>Al sumar el valor de la cuenta bancos del activo</w:t>
+      </w:r>
+      <w:r>
+        <w:rPr>
+          <w:lang w:val="es-419" w:eastAsia="es-CO"/>
+        </w:rPr>
+        <w:t>,</w:t>
+      </w:r>
+      <w:r>
+        <w:rPr>
+          <w:lang w:val="es-419" w:eastAsia="es-CO"/>
+        </w:rPr>
+        <w:t xml:space="preserve"> se tiene un total de 3.000.000. Respecto a los pasivos</w:t>
+      </w:r>
+      <w:r>
+        <w:rPr>
+          <w:lang w:val="es-419" w:eastAsia="es-CO"/>
+        </w:rPr>
+        <w:t>,</w:t>
+      </w:r>
+      <w:r>
+        <w:rPr>
+          <w:lang w:val="es-419" w:eastAsia="es-CO"/>
+        </w:rPr>
+        <w:t xml:space="preserve"> no se realiza ningún registro porque el enunciado del ejercicio únicamente hace referencia a los 3.000.000 en bancos. Finalmente, se tiene el siguiente patrimonio:</w:t>
       </w:r>
     </w:p>
     <w:p>
@@ -9336,6 +9436,7 @@
                 <w:color w:val="12263F"/>
                 <w:szCs w:val="24"/>
               </w:rPr>
+              <w:lastRenderedPageBreak/>
               <w:t>Total</w:t>
             </w:r>
             <w:proofErr w:type="gramEnd"/>
@@ -9427,69 +9528,6 @@
     </w:p>
     <w:p>
       <w:pPr>
-        <w:rPr>
-          <w:lang w:val="es-419" w:eastAsia="es-CO"/>
-        </w:rPr>
-      </w:pPr>
-    </w:p>
-    <w:p>
-      <w:pPr>
-        <w:rPr>
-          <w:lang w:val="es-419" w:eastAsia="es-CO"/>
-        </w:rPr>
-      </w:pPr>
-    </w:p>
-    <w:p>
-      <w:pPr>
-        <w:rPr>
-          <w:lang w:val="es-419" w:eastAsia="es-CO"/>
-        </w:rPr>
-      </w:pPr>
-    </w:p>
-    <w:p>
-      <w:pPr>
-        <w:rPr>
-          <w:lang w:val="es-419" w:eastAsia="es-CO"/>
-        </w:rPr>
-      </w:pPr>
-    </w:p>
-    <w:p>
-      <w:pPr>
-        <w:rPr>
-          <w:lang w:val="es-419" w:eastAsia="es-CO"/>
-        </w:rPr>
-      </w:pPr>
-    </w:p>
-    <w:p>
-      <w:pPr>
-        <w:rPr>
-          <w:lang w:val="es-419" w:eastAsia="es-CO"/>
-        </w:rPr>
-      </w:pPr>
-    </w:p>
-    <w:p>
-      <w:pPr>
-        <w:rPr>
-          <w:lang w:val="es-419" w:eastAsia="es-CO"/>
-        </w:rPr>
-      </w:pPr>
-    </w:p>
-    <w:p>
-      <w:pPr>
-        <w:rPr>
-          <w:lang w:val="es-419" w:eastAsia="es-CO"/>
-        </w:rPr>
-      </w:pPr>
-    </w:p>
-    <w:p>
-      <w:pPr>
-        <w:rPr>
-          <w:lang w:val="es-419" w:eastAsia="es-CO"/>
-        </w:rPr>
-      </w:pPr>
-    </w:p>
-    <w:p>
-      <w:pPr>
         <w:pStyle w:val="Video"/>
         <w:jc w:val="left"/>
         <w:rPr>
@@ -9500,17 +9538,14 @@
         <w:rPr>
           <w:lang w:val="es-419" w:eastAsia="es-CO"/>
         </w:rPr>
-        <w:lastRenderedPageBreak/>
         <w:t xml:space="preserve">Modificaciones en la ecuación </w:t>
       </w:r>
-      <w:proofErr w:type="spellStart"/>
-      <w:r>
-        <w:rPr>
-          <w:lang w:val="es-419" w:eastAsia="es-CO"/>
-        </w:rPr>
-        <w:t>patromonial</w:t>
-      </w:r>
-      <w:proofErr w:type="spellEnd"/>
+      <w:r>
+        <w:rPr>
+          <w:lang w:val="es-419" w:eastAsia="es-CO"/>
+        </w:rPr>
+        <w:t>patrimonial</w:t>
+      </w:r>
     </w:p>
     <w:p>
       <w:pPr>
@@ -9540,7 +9575,7 @@
                     </pic:cNvPicPr>
                   </pic:nvPicPr>
                   <pic:blipFill>
-                    <a:blip r:embed="rId28">
+                    <a:blip r:embed="rId26">
                       <a:extLst>
                         <a:ext uri="{28A0092B-C50C-407E-A947-70E740481C1C}">
                           <a14:useLocalDpi xmlns:a14="http://schemas.microsoft.com/office/drawing/2010/main" val="0"/>
@@ -9577,7 +9612,7 @@
         <w:ind w:firstLine="0"/>
         <w:jc w:val="center"/>
       </w:pPr>
-      <w:hyperlink r:id="rId29" w:history="1">
+      <w:hyperlink r:id="rId27" w:history="1">
         <w:r>
           <w:rPr>
             <w:rStyle w:val="Hipervnculo"/>
@@ -9641,10 +9676,10 @@
           <w:lang w:eastAsia="es-CO"/>
         </w:rPr>
         <w:drawing>
-          <wp:inline distT="0" distB="0" distL="0" distR="0" wp14:anchorId="30DB0E8F" wp14:editId="03933DB7">
+          <wp:inline distT="0" distB="0" distL="0" distR="0" wp14:anchorId="4377CCD4" wp14:editId="7234EF7B">
             <wp:extent cx="6332220" cy="5856605"/>
             <wp:effectExtent l="0" t="0" r="0" b="0"/>
-            <wp:docPr id="11" name="Gráfico 11" descr="La imagen presenta un esquema conceptual de cuentas nominales y registros contables, mostrando ingresos, gastos y costos, sus características y movimientos, además de cuentas de orden y registros contables, explicando la estructura básica utilizada para clasificar y registrar operaciones financieras."/>
+            <wp:docPr id="519392357" name="Gráfico 3"/>
             <wp:cNvGraphicFramePr>
               <a:graphicFrameLocks xmlns:a="http://schemas.openxmlformats.org/drawingml/2006/main" noChangeAspect="1"/>
             </wp:cNvGraphicFramePr>
@@ -9652,17 +9687,14 @@
               <a:graphicData uri="http://schemas.openxmlformats.org/drawingml/2006/picture">
                 <pic:pic xmlns:pic="http://schemas.openxmlformats.org/drawingml/2006/picture">
                   <pic:nvPicPr>
-                    <pic:cNvPr id="11" name="Gráfico 11" descr="La imagen presenta un esquema conceptual de cuentas nominales y registros contables, mostrando ingresos, gastos y costos, sus características y movimientos, además de cuentas de orden y registros contables, explicando la estructura básica utilizada para clasificar y registrar operaciones financieras."/>
+                    <pic:cNvPr id="519392357" name="Gráfico 519392357"/>
                     <pic:cNvPicPr/>
                   </pic:nvPicPr>
                   <pic:blipFill>
-                    <a:blip r:embed="rId30">
+                    <a:blip r:embed="rId28">
                       <a:extLst>
-                        <a:ext uri="{28A0092B-C50C-407E-A947-70E740481C1C}">
-                          <a14:useLocalDpi xmlns:a14="http://schemas.microsoft.com/office/drawing/2010/main" val="0"/>
-                        </a:ext>
                         <a:ext uri="{96DAC541-7B7A-43D3-8B79-37D633B846F1}">
-                          <asvg:svgBlip xmlns:asvg="http://schemas.microsoft.com/office/drawing/2016/SVG/main" r:embed="rId31"/>
+                          <asvg:svgBlip xmlns:asvg="http://schemas.microsoft.com/office/drawing/2016/SVG/main" r:embed="rId29"/>
                         </a:ext>
                       </a:extLst>
                     </a:blip>
@@ -10090,7 +10122,15 @@
       </w:r>
       <w:proofErr w:type="spellEnd"/>
       <w:r>
-        <w:t xml:space="preserve">, 2008.. Disponible en: </w:t>
+        <w:t xml:space="preserve">, </w:t>
+      </w:r>
+      <w:proofErr w:type="gramStart"/>
+      <w:r>
+        <w:t>2008..</w:t>
+      </w:r>
+      <w:proofErr w:type="gramEnd"/>
+      <w:r>
+        <w:t xml:space="preserve"> Disponible en: </w:t>
       </w:r>
     </w:p>
     <w:p>
@@ -10098,7 +10138,7 @@
         <w:pStyle w:val="Prrafodelista"/>
         <w:ind w:left="993" w:firstLine="0"/>
       </w:pPr>
-      <w:hyperlink r:id="rId32" w:history="1">
+      <w:hyperlink r:id="rId30" w:history="1">
         <w:r>
           <w:rPr>
             <w:rStyle w:val="Hipervnculo"/>
@@ -10139,13 +10179,8 @@
           <w:numId w:val="57"/>
         </w:numPr>
       </w:pPr>
-      <w:proofErr w:type="spellStart"/>
-      <w:r>
-        <w:t>Scoponi</w:t>
-      </w:r>
-      <w:proofErr w:type="spellEnd"/>
-      <w:r>
-        <w:t xml:space="preserve">, L. M., </w:t>
+      <w:r>
+        <w:t xml:space="preserve">Scoponi, L. M., </w:t>
       </w:r>
       <w:proofErr w:type="spellStart"/>
       <w:r>
@@ -10364,16 +10399,8 @@
               <w:rPr>
                 <w:lang w:val="es-CO"/>
               </w:rPr>
-              <w:t xml:space="preserve">Olga Constanza Bermúdez </w:t>
-            </w:r>
-            <w:proofErr w:type="spellStart"/>
-            <w:r>
-              <w:rPr>
-                <w:lang w:val="es-CO"/>
-              </w:rPr>
-              <w:t>Jaimes</w:t>
-            </w:r>
-            <w:proofErr w:type="spellEnd"/>
+              <w:t>Olga Constanza Bermúdez Jaimes</w:t>
+            </w:r>
           </w:p>
         </w:tc>
         <w:tc>
@@ -10587,44 +10614,8 @@
               <w:rPr>
                 <w:lang w:val="es-CO"/>
               </w:rPr>
-              <w:t xml:space="preserve">Juan </w:t>
-            </w:r>
-            <w:proofErr w:type="spellStart"/>
-            <w:r>
-              <w:rPr>
-                <w:lang w:val="es-CO"/>
-              </w:rPr>
-              <w:t>Jose</w:t>
-            </w:r>
-            <w:proofErr w:type="spellEnd"/>
-            <w:r>
-              <w:rPr>
-                <w:lang w:val="es-CO"/>
-              </w:rPr>
-              <w:t xml:space="preserve"> </w:t>
-            </w:r>
-            <w:proofErr w:type="spellStart"/>
-            <w:r>
-              <w:rPr>
-                <w:lang w:val="es-CO"/>
-              </w:rPr>
-              <w:t>Calderon</w:t>
-            </w:r>
-            <w:proofErr w:type="spellEnd"/>
-            <w:r>
-              <w:rPr>
-                <w:lang w:val="es-CO"/>
-              </w:rPr>
-              <w:t xml:space="preserve"> </w:t>
-            </w:r>
-            <w:proofErr w:type="spellStart"/>
-            <w:r>
-              <w:rPr>
-                <w:lang w:val="es-CO"/>
-              </w:rPr>
-              <w:t>Gutierrez</w:t>
-            </w:r>
-            <w:proofErr w:type="spellEnd"/>
+              <w:t>Juan Jose Calderon Gutierrez</w:t>
+            </w:r>
           </w:p>
         </w:tc>
         <w:tc>
@@ -11022,28 +11013,12 @@
                 <w:lang w:val="es-CO"/>
               </w:rPr>
             </w:pPr>
-            <w:proofErr w:type="spellStart"/>
             <w:r>
               <w:rPr>
                 <w:lang w:val="es-CO"/>
               </w:rPr>
-              <w:t>Maria</w:t>
-            </w:r>
-            <w:proofErr w:type="spellEnd"/>
-            <w:r>
-              <w:rPr>
-                <w:lang w:val="es-CO"/>
-              </w:rPr>
-              <w:t xml:space="preserve"> Carolina Tamayo </w:t>
-            </w:r>
-            <w:proofErr w:type="spellStart"/>
-            <w:r>
-              <w:rPr>
-                <w:lang w:val="es-CO"/>
-              </w:rPr>
-              <w:t>Lopez</w:t>
-            </w:r>
-            <w:proofErr w:type="spellEnd"/>
+              <w:t>Maria Carolina Tamayo Lopez</w:t>
+            </w:r>
           </w:p>
         </w:tc>
         <w:tc>
@@ -11329,21 +11304,7 @@
               <w:rPr>
                 <w:lang w:val="es-CO"/>
               </w:rPr>
-              <w:t xml:space="preserve"> Wilfredo </w:t>
-            </w:r>
-            <w:proofErr w:type="spellStart"/>
-            <w:r>
-              <w:rPr>
-                <w:lang w:val="es-CO"/>
-              </w:rPr>
-              <w:t>Pizo</w:t>
-            </w:r>
-            <w:proofErr w:type="spellEnd"/>
-            <w:r>
-              <w:rPr>
-                <w:lang w:val="es-CO"/>
-              </w:rPr>
-              <w:t xml:space="preserve"> Ossa</w:t>
+              <w:t xml:space="preserve"> Wilfredo Pizo Ossa</w:t>
             </w:r>
           </w:p>
         </w:tc>
@@ -11490,8 +11451,8 @@
       </w:pPr>
     </w:p>
     <w:sectPr>
-      <w:headerReference w:type="default" r:id="rId33"/>
-      <w:footerReference w:type="default" r:id="rId34"/>
+      <w:headerReference w:type="default" r:id="rId31"/>
+      <w:footerReference w:type="default" r:id="rId32"/>
       <w:pgSz w:w="12240" w:h="15840"/>
       <w:pgMar w:top="1701" w:right="1134" w:bottom="1134" w:left="1134" w:header="709" w:footer="737" w:gutter="0"/>
       <w:pgNumType w:start="1"/>
@@ -11504,7 +11465,7 @@
 </file>
 
 <file path=word/endnotes.xml><?xml version="1.0" encoding="utf-8"?>
-<w:endnotes xmlns:wpc="http://schemas.microsoft.com/office/word/2010/wordprocessingCanvas" xmlns:cx="http://schemas.microsoft.com/office/drawing/2014/chartex" xmlns:cx1="http://schemas.microsoft.com/office/drawing/2015/9/8/chartex" xmlns:cx2="http://schemas.microsoft.com/office/drawing/2015/10/21/chartex" xmlns:cx3="http://schemas.microsoft.com/office/drawing/2016/5/9/chartex" xmlns:cx4="http://schemas.microsoft.com/office/drawing/2016/5/10/chartex" xmlns:cx5="http://schemas.microsoft.com/office/drawing/2016/5/11/chartex" xmlns:cx6="http://schemas.microsoft.com/office/drawing/2016/5/12/chartex" xmlns:cx7="http://schemas.microsoft.com/office/drawing/2016/5/13/chartex" xmlns:cx8="http://schemas.microsoft.com/office/drawing/2016/5/14/chartex" xmlns:mc="http://schemas.openxmlformats.org/markup-compatibility/2006" xmlns:aink="http://schemas.microsoft.com/office/drawing/2016/ink" xmlns:am3d="http://schemas.microsoft.com/office/drawing/2017/model3d" xmlns:o="urn:schemas-microsoft-com:office:office" xmlns:r="http://schemas.openxmlformats.org/officeDocument/2006/relationships" xmlns:m="http://schemas.openxmlformats.org/officeDocument/2006/math" xmlns:v="urn:schemas-microsoft-com:vml" xmlns:wp14="http://schemas.microsoft.com/office/word/2010/wordprocessingDrawing" xmlns:wp="http://schemas.openxmlformats.org/drawingml/2006/wordprocessingDrawing" xmlns:w10="urn:schemas-microsoft-com:office:word" xmlns:w="http://schemas.openxmlformats.org/wordprocessingml/2006/main" xmlns:w14="http://schemas.microsoft.com/office/word/2010/wordml" xmlns:w15="http://schemas.microsoft.com/office/word/2012/wordml" xmlns:w16cex="http://schemas.microsoft.com/office/word/2018/wordml/cex" xmlns:w16cid="http://schemas.microsoft.com/office/word/2016/wordml/cid" xmlns:w16="http://schemas.microsoft.com/office/word/2018/wordml" xmlns:w16sdtdh="http://schemas.microsoft.com/office/word/2020/wordml/sdtdatahash" xmlns:w16se="http://schemas.microsoft.com/office/word/2015/wordml/symex" xmlns:wpg="http://schemas.microsoft.com/office/word/2010/wordprocessingGroup" xmlns:wpi="http://schemas.microsoft.com/office/word/2010/wordprocessingInk" xmlns:wne="http://schemas.microsoft.com/office/word/2006/wordml" xmlns:wps="http://schemas.microsoft.com/office/word/2010/wordprocessingShape" mc:Ignorable="w14 w15 w16se w16cid w16 w16cex w16sdtdh wp14">
+<w:endnotes xmlns:wpc="http://schemas.microsoft.com/office/word/2010/wordprocessingCanvas" xmlns:cx="http://schemas.microsoft.com/office/drawing/2014/chartex" xmlns:cx1="http://schemas.microsoft.com/office/drawing/2015/9/8/chartex" xmlns:cx2="http://schemas.microsoft.com/office/drawing/2015/10/21/chartex" xmlns:cx3="http://schemas.microsoft.com/office/drawing/2016/5/9/chartex" xmlns:cx4="http://schemas.microsoft.com/office/drawing/2016/5/10/chartex" xmlns:cx5="http://schemas.microsoft.com/office/drawing/2016/5/11/chartex" xmlns:cx6="http://schemas.microsoft.com/office/drawing/2016/5/12/chartex" xmlns:cx7="http://schemas.microsoft.com/office/drawing/2016/5/13/chartex" xmlns:cx8="http://schemas.microsoft.com/office/drawing/2016/5/14/chartex" xmlns:mc="http://schemas.openxmlformats.org/markup-compatibility/2006" xmlns:aink="http://schemas.microsoft.com/office/drawing/2016/ink" xmlns:am3d="http://schemas.microsoft.com/office/drawing/2017/model3d" xmlns:o="urn:schemas-microsoft-com:office:office" xmlns:oel="http://schemas.microsoft.com/office/2019/extlst" xmlns:r="http://schemas.openxmlformats.org/officeDocument/2006/relationships" xmlns:m="http://schemas.openxmlformats.org/officeDocument/2006/math" xmlns:v="urn:schemas-microsoft-com:vml" xmlns:wp14="http://schemas.microsoft.com/office/word/2010/wordprocessingDrawing" xmlns:wp="http://schemas.openxmlformats.org/drawingml/2006/wordprocessingDrawing" xmlns:w10="urn:schemas-microsoft-com:office:word" xmlns:w="http://schemas.openxmlformats.org/wordprocessingml/2006/main" xmlns:w14="http://schemas.microsoft.com/office/word/2010/wordml" xmlns:w15="http://schemas.microsoft.com/office/word/2012/wordml" xmlns:w16cex="http://schemas.microsoft.com/office/word/2018/wordml/cex" xmlns:w16cid="http://schemas.microsoft.com/office/word/2016/wordml/cid" xmlns:w16="http://schemas.microsoft.com/office/word/2018/wordml" xmlns:w16du="http://schemas.microsoft.com/office/word/2023/wordml/word16du" xmlns:w16sdtdh="http://schemas.microsoft.com/office/word/2020/wordml/sdtdatahash" xmlns:w16sdtfl="http://schemas.microsoft.com/office/word/2024/wordml/sdtformatlock" xmlns:w16se="http://schemas.microsoft.com/office/word/2015/wordml/symex" xmlns:wpg="http://schemas.microsoft.com/office/word/2010/wordprocessingGroup" xmlns:wpi="http://schemas.microsoft.com/office/word/2010/wordprocessingInk" xmlns:wne="http://schemas.microsoft.com/office/word/2006/wordml" xmlns:wps="http://schemas.microsoft.com/office/word/2010/wordprocessingShape" mc:Ignorable="w14 w15 w16se w16cid w16 w16cex w16sdtdh w16sdtfl w16du wp14">
   <w:endnote w:type="separator" w:id="-1">
     <w:p>
       <w:pPr>
@@ -11529,7 +11490,7 @@
 </file>
 
 <file path=word/footer1.xml><?xml version="1.0" encoding="utf-8"?>
-<w:ftr xmlns:wpc="http://schemas.microsoft.com/office/word/2010/wordprocessingCanvas" xmlns:cx="http://schemas.microsoft.com/office/drawing/2014/chartex" xmlns:cx1="http://schemas.microsoft.com/office/drawing/2015/9/8/chartex" xmlns:cx2="http://schemas.microsoft.com/office/drawing/2015/10/21/chartex" xmlns:cx3="http://schemas.microsoft.com/office/drawing/2016/5/9/chartex" xmlns:cx4="http://schemas.microsoft.com/office/drawing/2016/5/10/chartex" xmlns:cx5="http://schemas.microsoft.com/office/drawing/2016/5/11/chartex" xmlns:cx6="http://schemas.microsoft.com/office/drawing/2016/5/12/chartex" xmlns:cx7="http://schemas.microsoft.com/office/drawing/2016/5/13/chartex" xmlns:cx8="http://schemas.microsoft.com/office/drawing/2016/5/14/chartex" xmlns:mc="http://schemas.openxmlformats.org/markup-compatibility/2006" xmlns:aink="http://schemas.microsoft.com/office/drawing/2016/ink" xmlns:am3d="http://schemas.microsoft.com/office/drawing/2017/model3d" xmlns:o="urn:schemas-microsoft-com:office:office" xmlns:r="http://schemas.openxmlformats.org/officeDocument/2006/relationships" xmlns:m="http://schemas.openxmlformats.org/officeDocument/2006/math" xmlns:v="urn:schemas-microsoft-com:vml" xmlns:wp14="http://schemas.microsoft.com/office/word/2010/wordprocessingDrawing" xmlns:wp="http://schemas.openxmlformats.org/drawingml/2006/wordprocessingDrawing" xmlns:w10="urn:schemas-microsoft-com:office:word" xmlns:w="http://schemas.openxmlformats.org/wordprocessingml/2006/main" xmlns:w14="http://schemas.microsoft.com/office/word/2010/wordml" xmlns:w15="http://schemas.microsoft.com/office/word/2012/wordml" xmlns:w16cex="http://schemas.microsoft.com/office/word/2018/wordml/cex" xmlns:w16cid="http://schemas.microsoft.com/office/word/2016/wordml/cid" xmlns:w16="http://schemas.microsoft.com/office/word/2018/wordml" xmlns:w16sdtdh="http://schemas.microsoft.com/office/word/2020/wordml/sdtdatahash" xmlns:w16se="http://schemas.microsoft.com/office/word/2015/wordml/symex" xmlns:wpg="http://schemas.microsoft.com/office/word/2010/wordprocessingGroup" xmlns:wpi="http://schemas.microsoft.com/office/word/2010/wordprocessingInk" xmlns:wne="http://schemas.microsoft.com/office/word/2006/wordml" xmlns:wps="http://schemas.microsoft.com/office/word/2010/wordprocessingShape" mc:Ignorable="w14 w15 w16se w16cid w16 w16cex w16sdtdh wp14">
+<w:ftr xmlns:wpc="http://schemas.microsoft.com/office/word/2010/wordprocessingCanvas" xmlns:cx="http://schemas.microsoft.com/office/drawing/2014/chartex" xmlns:cx1="http://schemas.microsoft.com/office/drawing/2015/9/8/chartex" xmlns:cx2="http://schemas.microsoft.com/office/drawing/2015/10/21/chartex" xmlns:cx3="http://schemas.microsoft.com/office/drawing/2016/5/9/chartex" xmlns:cx4="http://schemas.microsoft.com/office/drawing/2016/5/10/chartex" xmlns:cx5="http://schemas.microsoft.com/office/drawing/2016/5/11/chartex" xmlns:cx6="http://schemas.microsoft.com/office/drawing/2016/5/12/chartex" xmlns:cx7="http://schemas.microsoft.com/office/drawing/2016/5/13/chartex" xmlns:cx8="http://schemas.microsoft.com/office/drawing/2016/5/14/chartex" xmlns:mc="http://schemas.openxmlformats.org/markup-compatibility/2006" xmlns:aink="http://schemas.microsoft.com/office/drawing/2016/ink" xmlns:am3d="http://schemas.microsoft.com/office/drawing/2017/model3d" xmlns:o="urn:schemas-microsoft-com:office:office" xmlns:oel="http://schemas.microsoft.com/office/2019/extlst" xmlns:r="http://schemas.openxmlformats.org/officeDocument/2006/relationships" xmlns:m="http://schemas.openxmlformats.org/officeDocument/2006/math" xmlns:v="urn:schemas-microsoft-com:vml" xmlns:wp14="http://schemas.microsoft.com/office/word/2010/wordprocessingDrawing" xmlns:wp="http://schemas.openxmlformats.org/drawingml/2006/wordprocessingDrawing" xmlns:w10="urn:schemas-microsoft-com:office:word" xmlns:w="http://schemas.openxmlformats.org/wordprocessingml/2006/main" xmlns:w14="http://schemas.microsoft.com/office/word/2010/wordml" xmlns:w15="http://schemas.microsoft.com/office/word/2012/wordml" xmlns:w16cex="http://schemas.microsoft.com/office/word/2018/wordml/cex" xmlns:w16cid="http://schemas.microsoft.com/office/word/2016/wordml/cid" xmlns:w16="http://schemas.microsoft.com/office/word/2018/wordml" xmlns:w16du="http://schemas.microsoft.com/office/word/2023/wordml/word16du" xmlns:w16sdtdh="http://schemas.microsoft.com/office/word/2020/wordml/sdtdatahash" xmlns:w16sdtfl="http://schemas.microsoft.com/office/word/2024/wordml/sdtformatlock" xmlns:w16se="http://schemas.microsoft.com/office/word/2015/wordml/symex" xmlns:wpg="http://schemas.microsoft.com/office/word/2010/wordprocessingGroup" xmlns:wpi="http://schemas.microsoft.com/office/word/2010/wordprocessingInk" xmlns:wne="http://schemas.microsoft.com/office/word/2006/wordml" xmlns:wps="http://schemas.microsoft.com/office/word/2010/wordprocessingShape" mc:Ignorable="w14 w15 w16se w16cid w16 w16cex w16sdtdh w16sdtfl w16du wp14">
   <w:sdt>
     <w:sdtPr>
       <w:id w:val="-1465197936"/>
@@ -11538,7 +11499,6 @@
         <w:docPartUnique/>
       </w:docPartObj>
     </w:sdtPr>
-    <w:sdtEndPr/>
     <w:sdtContent>
       <w:p>
         <w:pPr>
@@ -11575,7 +11535,7 @@
 </file>
 
 <file path=word/footnotes.xml><?xml version="1.0" encoding="utf-8"?>
-<w:footnotes xmlns:wpc="http://schemas.microsoft.com/office/word/2010/wordprocessingCanvas" xmlns:cx="http://schemas.microsoft.com/office/drawing/2014/chartex" xmlns:cx1="http://schemas.microsoft.com/office/drawing/2015/9/8/chartex" xmlns:cx2="http://schemas.microsoft.com/office/drawing/2015/10/21/chartex" xmlns:cx3="http://schemas.microsoft.com/office/drawing/2016/5/9/chartex" xmlns:cx4="http://schemas.microsoft.com/office/drawing/2016/5/10/chartex" xmlns:cx5="http://schemas.microsoft.com/office/drawing/2016/5/11/chartex" xmlns:cx6="http://schemas.microsoft.com/office/drawing/2016/5/12/chartex" xmlns:cx7="http://schemas.microsoft.com/office/drawing/2016/5/13/chartex" xmlns:cx8="http://schemas.microsoft.com/office/drawing/2016/5/14/chartex" xmlns:mc="http://schemas.openxmlformats.org/markup-compatibility/2006" xmlns:aink="http://schemas.microsoft.com/office/drawing/2016/ink" xmlns:am3d="http://schemas.microsoft.com/office/drawing/2017/model3d" xmlns:o="urn:schemas-microsoft-com:office:office" xmlns:r="http://schemas.openxmlformats.org/officeDocument/2006/relationships" xmlns:m="http://schemas.openxmlformats.org/officeDocument/2006/math" xmlns:v="urn:schemas-microsoft-com:vml" xmlns:wp14="http://schemas.microsoft.com/office/word/2010/wordprocessingDrawing" xmlns:wp="http://schemas.openxmlformats.org/drawingml/2006/wordprocessingDrawing" xmlns:w10="urn:schemas-microsoft-com:office:word" xmlns:w="http://schemas.openxmlformats.org/wordprocessingml/2006/main" xmlns:w14="http://schemas.microsoft.com/office/word/2010/wordml" xmlns:w15="http://schemas.microsoft.com/office/word/2012/wordml" xmlns:w16cex="http://schemas.microsoft.com/office/word/2018/wordml/cex" xmlns:w16cid="http://schemas.microsoft.com/office/word/2016/wordml/cid" xmlns:w16="http://schemas.microsoft.com/office/word/2018/wordml" xmlns:w16sdtdh="http://schemas.microsoft.com/office/word/2020/wordml/sdtdatahash" xmlns:w16se="http://schemas.microsoft.com/office/word/2015/wordml/symex" xmlns:wpg="http://schemas.microsoft.com/office/word/2010/wordprocessingGroup" xmlns:wpi="http://schemas.microsoft.com/office/word/2010/wordprocessingInk" xmlns:wne="http://schemas.microsoft.com/office/word/2006/wordml" xmlns:wps="http://schemas.microsoft.com/office/word/2010/wordprocessingShape" mc:Ignorable="w14 w15 w16se w16cid w16 w16cex w16sdtdh wp14">
+<w:footnotes xmlns:wpc="http://schemas.microsoft.com/office/word/2010/wordprocessingCanvas" xmlns:cx="http://schemas.microsoft.com/office/drawing/2014/chartex" xmlns:cx1="http://schemas.microsoft.com/office/drawing/2015/9/8/chartex" xmlns:cx2="http://schemas.microsoft.com/office/drawing/2015/10/21/chartex" xmlns:cx3="http://schemas.microsoft.com/office/drawing/2016/5/9/chartex" xmlns:cx4="http://schemas.microsoft.com/office/drawing/2016/5/10/chartex" xmlns:cx5="http://schemas.microsoft.com/office/drawing/2016/5/11/chartex" xmlns:cx6="http://schemas.microsoft.com/office/drawing/2016/5/12/chartex" xmlns:cx7="http://schemas.microsoft.com/office/drawing/2016/5/13/chartex" xmlns:cx8="http://schemas.microsoft.com/office/drawing/2016/5/14/chartex" xmlns:mc="http://schemas.openxmlformats.org/markup-compatibility/2006" xmlns:aink="http://schemas.microsoft.com/office/drawing/2016/ink" xmlns:am3d="http://schemas.microsoft.com/office/drawing/2017/model3d" xmlns:o="urn:schemas-microsoft-com:office:office" xmlns:oel="http://schemas.microsoft.com/office/2019/extlst" xmlns:r="http://schemas.openxmlformats.org/officeDocument/2006/relationships" xmlns:m="http://schemas.openxmlformats.org/officeDocument/2006/math" xmlns:v="urn:schemas-microsoft-com:vml" xmlns:wp14="http://schemas.microsoft.com/office/word/2010/wordprocessingDrawing" xmlns:wp="http://schemas.openxmlformats.org/drawingml/2006/wordprocessingDrawing" xmlns:w10="urn:schemas-microsoft-com:office:word" xmlns:w="http://schemas.openxmlformats.org/wordprocessingml/2006/main" xmlns:w14="http://schemas.microsoft.com/office/word/2010/wordml" xmlns:w15="http://schemas.microsoft.com/office/word/2012/wordml" xmlns:w16cex="http://schemas.microsoft.com/office/word/2018/wordml/cex" xmlns:w16cid="http://schemas.microsoft.com/office/word/2016/wordml/cid" xmlns:w16="http://schemas.microsoft.com/office/word/2018/wordml" xmlns:w16du="http://schemas.microsoft.com/office/word/2023/wordml/word16du" xmlns:w16sdtdh="http://schemas.microsoft.com/office/word/2020/wordml/sdtdatahash" xmlns:w16sdtfl="http://schemas.microsoft.com/office/word/2024/wordml/sdtformatlock" xmlns:w16se="http://schemas.microsoft.com/office/word/2015/wordml/symex" xmlns:wpg="http://schemas.microsoft.com/office/word/2010/wordprocessingGroup" xmlns:wpi="http://schemas.microsoft.com/office/word/2010/wordprocessingInk" xmlns:wne="http://schemas.microsoft.com/office/word/2006/wordml" xmlns:wps="http://schemas.microsoft.com/office/word/2010/wordprocessingShape" mc:Ignorable="w14 w15 w16se w16cid w16 w16cex w16sdtdh w16sdtfl w16du wp14">
   <w:footnote w:type="separator" w:id="-1">
     <w:p>
       <w:pPr>
@@ -11600,7 +11560,7 @@
 </file>
 
 <file path=word/header1.xml><?xml version="1.0" encoding="utf-8"?>
-<w:hdr xmlns:wpc="http://schemas.microsoft.com/office/word/2010/wordprocessingCanvas" xmlns:cx="http://schemas.microsoft.com/office/drawing/2014/chartex" xmlns:cx1="http://schemas.microsoft.com/office/drawing/2015/9/8/chartex" xmlns:cx2="http://schemas.microsoft.com/office/drawing/2015/10/21/chartex" xmlns:cx3="http://schemas.microsoft.com/office/drawing/2016/5/9/chartex" xmlns:cx4="http://schemas.microsoft.com/office/drawing/2016/5/10/chartex" xmlns:cx5="http://schemas.microsoft.com/office/drawing/2016/5/11/chartex" xmlns:cx6="http://schemas.microsoft.com/office/drawing/2016/5/12/chartex" xmlns:cx7="http://schemas.microsoft.com/office/drawing/2016/5/13/chartex" xmlns:cx8="http://schemas.microsoft.com/office/drawing/2016/5/14/chartex" xmlns:mc="http://schemas.openxmlformats.org/markup-compatibility/2006" xmlns:aink="http://schemas.microsoft.com/office/drawing/2016/ink" xmlns:am3d="http://schemas.microsoft.com/office/drawing/2017/model3d" xmlns:o="urn:schemas-microsoft-com:office:office" xmlns:r="http://schemas.openxmlformats.org/officeDocument/2006/relationships" xmlns:m="http://schemas.openxmlformats.org/officeDocument/2006/math" xmlns:v="urn:schemas-microsoft-com:vml" xmlns:wp14="http://schemas.microsoft.com/office/word/2010/wordprocessingDrawing" xmlns:wp="http://schemas.openxmlformats.org/drawingml/2006/wordprocessingDrawing" xmlns:w10="urn:schemas-microsoft-com:office:word" xmlns:w="http://schemas.openxmlformats.org/wordprocessingml/2006/main" xmlns:w14="http://schemas.microsoft.com/office/word/2010/wordml" xmlns:w15="http://schemas.microsoft.com/office/word/2012/wordml" xmlns:w16cex="http://schemas.microsoft.com/office/word/2018/wordml/cex" xmlns:w16cid="http://schemas.microsoft.com/office/word/2016/wordml/cid" xmlns:w16="http://schemas.microsoft.com/office/word/2018/wordml" xmlns:w16sdtdh="http://schemas.microsoft.com/office/word/2020/wordml/sdtdatahash" xmlns:w16se="http://schemas.microsoft.com/office/word/2015/wordml/symex" xmlns:wpg="http://schemas.microsoft.com/office/word/2010/wordprocessingGroup" xmlns:wpi="http://schemas.microsoft.com/office/word/2010/wordprocessingInk" xmlns:wne="http://schemas.microsoft.com/office/word/2006/wordml" xmlns:wps="http://schemas.microsoft.com/office/word/2010/wordprocessingShape" mc:Ignorable="w14 w15 w16se w16cid w16 w16cex w16sdtdh wp14">
+<w:hdr xmlns:wpc="http://schemas.microsoft.com/office/word/2010/wordprocessingCanvas" xmlns:cx="http://schemas.microsoft.com/office/drawing/2014/chartex" xmlns:cx1="http://schemas.microsoft.com/office/drawing/2015/9/8/chartex" xmlns:cx2="http://schemas.microsoft.com/office/drawing/2015/10/21/chartex" xmlns:cx3="http://schemas.microsoft.com/office/drawing/2016/5/9/chartex" xmlns:cx4="http://schemas.microsoft.com/office/drawing/2016/5/10/chartex" xmlns:cx5="http://schemas.microsoft.com/office/drawing/2016/5/11/chartex" xmlns:cx6="http://schemas.microsoft.com/office/drawing/2016/5/12/chartex" xmlns:cx7="http://schemas.microsoft.com/office/drawing/2016/5/13/chartex" xmlns:cx8="http://schemas.microsoft.com/office/drawing/2016/5/14/chartex" xmlns:mc="http://schemas.openxmlformats.org/markup-compatibility/2006" xmlns:aink="http://schemas.microsoft.com/office/drawing/2016/ink" xmlns:am3d="http://schemas.microsoft.com/office/drawing/2017/model3d" xmlns:o="urn:schemas-microsoft-com:office:office" xmlns:oel="http://schemas.microsoft.com/office/2019/extlst" xmlns:r="http://schemas.openxmlformats.org/officeDocument/2006/relationships" xmlns:m="http://schemas.openxmlformats.org/officeDocument/2006/math" xmlns:v="urn:schemas-microsoft-com:vml" xmlns:wp14="http://schemas.microsoft.com/office/word/2010/wordprocessingDrawing" xmlns:wp="http://schemas.openxmlformats.org/drawingml/2006/wordprocessingDrawing" xmlns:w10="urn:schemas-microsoft-com:office:word" xmlns:w="http://schemas.openxmlformats.org/wordprocessingml/2006/main" xmlns:w14="http://schemas.microsoft.com/office/word/2010/wordml" xmlns:w15="http://schemas.microsoft.com/office/word/2012/wordml" xmlns:w16cex="http://schemas.microsoft.com/office/word/2018/wordml/cex" xmlns:w16cid="http://schemas.microsoft.com/office/word/2016/wordml/cid" xmlns:w16="http://schemas.microsoft.com/office/word/2018/wordml" xmlns:w16du="http://schemas.microsoft.com/office/word/2023/wordml/word16du" xmlns:w16sdtdh="http://schemas.microsoft.com/office/word/2020/wordml/sdtdatahash" xmlns:w16sdtfl="http://schemas.microsoft.com/office/word/2024/wordml/sdtformatlock" xmlns:w16se="http://schemas.microsoft.com/office/word/2015/wordml/symex" xmlns:wpg="http://schemas.microsoft.com/office/word/2010/wordprocessingGroup" xmlns:wpi="http://schemas.microsoft.com/office/word/2010/wordprocessingInk" xmlns:wne="http://schemas.microsoft.com/office/word/2006/wordml" xmlns:wps="http://schemas.microsoft.com/office/word/2010/wordprocessingShape" mc:Ignorable="w14 w15 w16se w16cid w16 w16cex w16sdtdh w16sdtfl w16du wp14">
   <w:p>
     <w:pPr>
       <w:pStyle w:val="Encabezado"/>
@@ -11686,7 +11646,7 @@
 </file>
 
 <file path=word/numbering.xml><?xml version="1.0" encoding="utf-8"?>
-<w:numbering xmlns:wpc="http://schemas.microsoft.com/office/word/2010/wordprocessingCanvas" xmlns:cx="http://schemas.microsoft.com/office/drawing/2014/chartex" xmlns:cx1="http://schemas.microsoft.com/office/drawing/2015/9/8/chartex" xmlns:cx2="http://schemas.microsoft.com/office/drawing/2015/10/21/chartex" xmlns:cx3="http://schemas.microsoft.com/office/drawing/2016/5/9/chartex" xmlns:cx4="http://schemas.microsoft.com/office/drawing/2016/5/10/chartex" xmlns:cx5="http://schemas.microsoft.com/office/drawing/2016/5/11/chartex" xmlns:cx6="http://schemas.microsoft.com/office/drawing/2016/5/12/chartex" xmlns:cx7="http://schemas.microsoft.com/office/drawing/2016/5/13/chartex" xmlns:cx8="http://schemas.microsoft.com/office/drawing/2016/5/14/chartex" xmlns:mc="http://schemas.openxmlformats.org/markup-compatibility/2006" xmlns:aink="http://schemas.microsoft.com/office/drawing/2016/ink" xmlns:am3d="http://schemas.microsoft.com/office/drawing/2017/model3d" xmlns:o="urn:schemas-microsoft-com:office:office" xmlns:r="http://schemas.openxmlformats.org/officeDocument/2006/relationships" xmlns:m="http://schemas.openxmlformats.org/officeDocument/2006/math" xmlns:v="urn:schemas-microsoft-com:vml" xmlns:wp14="http://schemas.microsoft.com/office/word/2010/wordprocessingDrawing" xmlns:wp="http://schemas.openxmlformats.org/drawingml/2006/wordprocessingDrawing" xmlns:w10="urn:schemas-microsoft-com:office:word" xmlns:w="http://schemas.openxmlformats.org/wordprocessingml/2006/main" xmlns:w14="http://schemas.microsoft.com/office/word/2010/wordml" xmlns:w15="http://schemas.microsoft.com/office/word/2012/wordml" xmlns:w16cex="http://schemas.microsoft.com/office/word/2018/wordml/cex" xmlns:w16cid="http://schemas.microsoft.com/office/word/2016/wordml/cid" xmlns:w16="http://schemas.microsoft.com/office/word/2018/wordml" xmlns:w16sdtdh="http://schemas.microsoft.com/office/word/2020/wordml/sdtdatahash" xmlns:w16se="http://schemas.microsoft.com/office/word/2015/wordml/symex" xmlns:wpg="http://schemas.microsoft.com/office/word/2010/wordprocessingGroup" xmlns:wpi="http://schemas.microsoft.com/office/word/2010/wordprocessingInk" xmlns:wne="http://schemas.microsoft.com/office/word/2006/wordml" xmlns:wps="http://schemas.microsoft.com/office/word/2010/wordprocessingShape" mc:Ignorable="w14 w15 w16se w16cid w16 w16cex w16sdtdh wp14">
+<w:numbering xmlns:wpc="http://schemas.microsoft.com/office/word/2010/wordprocessingCanvas" xmlns:cx="http://schemas.microsoft.com/office/drawing/2014/chartex" xmlns:cx1="http://schemas.microsoft.com/office/drawing/2015/9/8/chartex" xmlns:cx2="http://schemas.microsoft.com/office/drawing/2015/10/21/chartex" xmlns:cx3="http://schemas.microsoft.com/office/drawing/2016/5/9/chartex" xmlns:cx4="http://schemas.microsoft.com/office/drawing/2016/5/10/chartex" xmlns:cx5="http://schemas.microsoft.com/office/drawing/2016/5/11/chartex" xmlns:cx6="http://schemas.microsoft.com/office/drawing/2016/5/12/chartex" xmlns:cx7="http://schemas.microsoft.com/office/drawing/2016/5/13/chartex" xmlns:cx8="http://schemas.microsoft.com/office/drawing/2016/5/14/chartex" xmlns:mc="http://schemas.openxmlformats.org/markup-compatibility/2006" xmlns:aink="http://schemas.microsoft.com/office/drawing/2016/ink" xmlns:am3d="http://schemas.microsoft.com/office/drawing/2017/model3d" xmlns:o="urn:schemas-microsoft-com:office:office" xmlns:oel="http://schemas.microsoft.com/office/2019/extlst" xmlns:r="http://schemas.openxmlformats.org/officeDocument/2006/relationships" xmlns:m="http://schemas.openxmlformats.org/officeDocument/2006/math" xmlns:v="urn:schemas-microsoft-com:vml" xmlns:wp14="http://schemas.microsoft.com/office/word/2010/wordprocessingDrawing" xmlns:wp="http://schemas.openxmlformats.org/drawingml/2006/wordprocessingDrawing" xmlns:w10="urn:schemas-microsoft-com:office:word" xmlns:w="http://schemas.openxmlformats.org/wordprocessingml/2006/main" xmlns:w14="http://schemas.microsoft.com/office/word/2010/wordml" xmlns:w15="http://schemas.microsoft.com/office/word/2012/wordml" xmlns:w16cex="http://schemas.microsoft.com/office/word/2018/wordml/cex" xmlns:w16cid="http://schemas.microsoft.com/office/word/2016/wordml/cid" xmlns:w16="http://schemas.microsoft.com/office/word/2018/wordml" xmlns:w16du="http://schemas.microsoft.com/office/word/2023/wordml/word16du" xmlns:w16sdtdh="http://schemas.microsoft.com/office/word/2020/wordml/sdtdatahash" xmlns:w16sdtfl="http://schemas.microsoft.com/office/word/2024/wordml/sdtformatlock" xmlns:w16se="http://schemas.microsoft.com/office/word/2015/wordml/symex" xmlns:wpg="http://schemas.microsoft.com/office/word/2010/wordprocessingGroup" xmlns:wpi="http://schemas.microsoft.com/office/word/2010/wordprocessingInk" xmlns:wne="http://schemas.microsoft.com/office/word/2006/wordml" xmlns:wps="http://schemas.microsoft.com/office/word/2010/wordprocessingShape" mc:Ignorable="w14 w15 w16se w16cid w16 w16cex w16sdtdh w16sdtfl w16du wp14">
   <w:abstractNum w:abstractNumId="0" w15:restartNumberingAfterBreak="0">
     <w:nsid w:val="FFFFFF89"/>
     <w:multiLevelType w:val="singleLevel"/>
@@ -17996,175 +17956,175 @@
       </w:rPr>
     </w:lvl>
   </w:abstractNum>
-  <w:num w:numId="1">
+  <w:num w:numId="1" w16cid:durableId="655184304">
     <w:abstractNumId w:val="54"/>
   </w:num>
-  <w:num w:numId="2">
+  <w:num w:numId="2" w16cid:durableId="1996715202">
     <w:abstractNumId w:val="0"/>
   </w:num>
-  <w:num w:numId="3">
+  <w:num w:numId="3" w16cid:durableId="1022895764">
     <w:abstractNumId w:val="21"/>
   </w:num>
-  <w:num w:numId="4">
+  <w:num w:numId="4" w16cid:durableId="693503509">
     <w:abstractNumId w:val="41"/>
   </w:num>
-  <w:num w:numId="5">
+  <w:num w:numId="5" w16cid:durableId="1441073781">
     <w:abstractNumId w:val="29"/>
   </w:num>
-  <w:num w:numId="6">
+  <w:num w:numId="6" w16cid:durableId="780539150">
     <w:abstractNumId w:val="56"/>
   </w:num>
-  <w:num w:numId="7">
+  <w:num w:numId="7" w16cid:durableId="179660695">
     <w:abstractNumId w:val="11"/>
   </w:num>
-  <w:num w:numId="8">
+  <w:num w:numId="8" w16cid:durableId="213808623">
     <w:abstractNumId w:val="14"/>
   </w:num>
-  <w:num w:numId="9">
+  <w:num w:numId="9" w16cid:durableId="297952946">
     <w:abstractNumId w:val="16"/>
   </w:num>
-  <w:num w:numId="10">
+  <w:num w:numId="10" w16cid:durableId="1505784019">
     <w:abstractNumId w:val="8"/>
   </w:num>
-  <w:num w:numId="11">
+  <w:num w:numId="11" w16cid:durableId="873234112">
     <w:abstractNumId w:val="30"/>
   </w:num>
-  <w:num w:numId="12">
+  <w:num w:numId="12" w16cid:durableId="1457482001">
     <w:abstractNumId w:val="49"/>
   </w:num>
-  <w:num w:numId="13">
+  <w:num w:numId="13" w16cid:durableId="1370377522">
     <w:abstractNumId w:val="46"/>
   </w:num>
-  <w:num w:numId="14">
+  <w:num w:numId="14" w16cid:durableId="389882169">
     <w:abstractNumId w:val="12"/>
   </w:num>
-  <w:num w:numId="15">
+  <w:num w:numId="15" w16cid:durableId="1561746572">
     <w:abstractNumId w:val="3"/>
   </w:num>
-  <w:num w:numId="16">
+  <w:num w:numId="16" w16cid:durableId="616109840">
     <w:abstractNumId w:val="34"/>
   </w:num>
-  <w:num w:numId="17">
+  <w:num w:numId="17" w16cid:durableId="2047752241">
     <w:abstractNumId w:val="18"/>
   </w:num>
-  <w:num w:numId="18">
+  <w:num w:numId="18" w16cid:durableId="752123142">
     <w:abstractNumId w:val="51"/>
   </w:num>
-  <w:num w:numId="19">
+  <w:num w:numId="19" w16cid:durableId="1811098198">
     <w:abstractNumId w:val="24"/>
   </w:num>
-  <w:num w:numId="20">
+  <w:num w:numId="20" w16cid:durableId="820535402">
     <w:abstractNumId w:val="55"/>
   </w:num>
-  <w:num w:numId="21">
+  <w:num w:numId="21" w16cid:durableId="1832673466">
     <w:abstractNumId w:val="42"/>
   </w:num>
-  <w:num w:numId="22">
+  <w:num w:numId="22" w16cid:durableId="66920990">
     <w:abstractNumId w:val="27"/>
   </w:num>
-  <w:num w:numId="23">
+  <w:num w:numId="23" w16cid:durableId="1999264495">
     <w:abstractNumId w:val="1"/>
   </w:num>
-  <w:num w:numId="24">
+  <w:num w:numId="24" w16cid:durableId="2068406948">
     <w:abstractNumId w:val="43"/>
   </w:num>
-  <w:num w:numId="25">
+  <w:num w:numId="25" w16cid:durableId="509149203">
     <w:abstractNumId w:val="32"/>
   </w:num>
-  <w:num w:numId="26">
+  <w:num w:numId="26" w16cid:durableId="614486088">
     <w:abstractNumId w:val="26"/>
   </w:num>
-  <w:num w:numId="27">
+  <w:num w:numId="27" w16cid:durableId="2093968111">
     <w:abstractNumId w:val="50"/>
   </w:num>
-  <w:num w:numId="28">
+  <w:num w:numId="28" w16cid:durableId="1203129700">
     <w:abstractNumId w:val="45"/>
   </w:num>
-  <w:num w:numId="29">
+  <w:num w:numId="29" w16cid:durableId="147089802">
     <w:abstractNumId w:val="23"/>
   </w:num>
-  <w:num w:numId="30">
+  <w:num w:numId="30" w16cid:durableId="818494532">
     <w:abstractNumId w:val="31"/>
   </w:num>
-  <w:num w:numId="31">
+  <w:num w:numId="31" w16cid:durableId="701515208">
     <w:abstractNumId w:val="17"/>
   </w:num>
-  <w:num w:numId="32">
+  <w:num w:numId="32" w16cid:durableId="1231622323">
     <w:abstractNumId w:val="10"/>
   </w:num>
-  <w:num w:numId="33">
+  <w:num w:numId="33" w16cid:durableId="420100437">
     <w:abstractNumId w:val="2"/>
   </w:num>
-  <w:num w:numId="34">
+  <w:num w:numId="34" w16cid:durableId="1750540957">
     <w:abstractNumId w:val="33"/>
   </w:num>
-  <w:num w:numId="35">
+  <w:num w:numId="35" w16cid:durableId="748161022">
     <w:abstractNumId w:val="47"/>
   </w:num>
-  <w:num w:numId="36">
+  <w:num w:numId="36" w16cid:durableId="1777093313">
     <w:abstractNumId w:val="9"/>
   </w:num>
-  <w:num w:numId="37">
+  <w:num w:numId="37" w16cid:durableId="1432698794">
     <w:abstractNumId w:val="28"/>
   </w:num>
-  <w:num w:numId="38">
+  <w:num w:numId="38" w16cid:durableId="1866819243">
     <w:abstractNumId w:val="5"/>
   </w:num>
-  <w:num w:numId="39">
+  <w:num w:numId="39" w16cid:durableId="677928142">
     <w:abstractNumId w:val="38"/>
   </w:num>
-  <w:num w:numId="40">
+  <w:num w:numId="40" w16cid:durableId="1125587048">
     <w:abstractNumId w:val="20"/>
   </w:num>
-  <w:num w:numId="41">
+  <w:num w:numId="41" w16cid:durableId="1222251108">
     <w:abstractNumId w:val="52"/>
   </w:num>
-  <w:num w:numId="42">
+  <w:num w:numId="42" w16cid:durableId="771752292">
     <w:abstractNumId w:val="39"/>
   </w:num>
-  <w:num w:numId="43">
+  <w:num w:numId="43" w16cid:durableId="745110271">
     <w:abstractNumId w:val="35"/>
   </w:num>
-  <w:num w:numId="44">
+  <w:num w:numId="44" w16cid:durableId="469176478">
     <w:abstractNumId w:val="19"/>
   </w:num>
-  <w:num w:numId="45">
+  <w:num w:numId="45" w16cid:durableId="956528994">
     <w:abstractNumId w:val="40"/>
   </w:num>
-  <w:num w:numId="46">
+  <w:num w:numId="46" w16cid:durableId="868880185">
     <w:abstractNumId w:val="22"/>
   </w:num>
-  <w:num w:numId="47">
+  <w:num w:numId="47" w16cid:durableId="251816657">
     <w:abstractNumId w:val="13"/>
   </w:num>
-  <w:num w:numId="48">
+  <w:num w:numId="48" w16cid:durableId="784075614">
     <w:abstractNumId w:val="37"/>
   </w:num>
-  <w:num w:numId="49">
+  <w:num w:numId="49" w16cid:durableId="297347348">
     <w:abstractNumId w:val="4"/>
   </w:num>
-  <w:num w:numId="50">
+  <w:num w:numId="50" w16cid:durableId="1597903720">
     <w:abstractNumId w:val="48"/>
   </w:num>
-  <w:num w:numId="51">
+  <w:num w:numId="51" w16cid:durableId="729764011">
     <w:abstractNumId w:val="15"/>
   </w:num>
-  <w:num w:numId="52">
+  <w:num w:numId="52" w16cid:durableId="1191455356">
     <w:abstractNumId w:val="44"/>
   </w:num>
-  <w:num w:numId="53">
+  <w:num w:numId="53" w16cid:durableId="526453708">
     <w:abstractNumId w:val="53"/>
   </w:num>
-  <w:num w:numId="54">
+  <w:num w:numId="54" w16cid:durableId="1741245782">
     <w:abstractNumId w:val="7"/>
   </w:num>
-  <w:num w:numId="55">
+  <w:num w:numId="55" w16cid:durableId="1003629990">
     <w:abstractNumId w:val="25"/>
   </w:num>
-  <w:num w:numId="56">
+  <w:num w:numId="56" w16cid:durableId="529491381">
     <w:abstractNumId w:val="36"/>
   </w:num>
-  <w:num w:numId="57">
+  <w:num w:numId="57" w16cid:durableId="790855271">
     <w:abstractNumId w:val="6"/>
   </w:num>
   <w:numIdMacAtCleanup w:val="48"/>
@@ -18172,7 +18132,7 @@
 </file>
 
 <file path=word/styles.xml><?xml version="1.0" encoding="utf-8"?>
-<w:styles xmlns:mc="http://schemas.openxmlformats.org/markup-compatibility/2006" xmlns:r="http://schemas.openxmlformats.org/officeDocument/2006/relationships" xmlns:w="http://schemas.openxmlformats.org/wordprocessingml/2006/main" xmlns:w14="http://schemas.microsoft.com/office/word/2010/wordml" xmlns:w15="http://schemas.microsoft.com/office/word/2012/wordml" xmlns:w16cex="http://schemas.microsoft.com/office/word/2018/wordml/cex" xmlns:w16cid="http://schemas.microsoft.com/office/word/2016/wordml/cid" xmlns:w16="http://schemas.microsoft.com/office/word/2018/wordml" xmlns:w16sdtdh="http://schemas.microsoft.com/office/word/2020/wordml/sdtdatahash" xmlns:w16se="http://schemas.microsoft.com/office/word/2015/wordml/symex" mc:Ignorable="w14 w15 w16se w16cid w16 w16cex w16sdtdh">
+<w:styles xmlns:mc="http://schemas.openxmlformats.org/markup-compatibility/2006" xmlns:r="http://schemas.openxmlformats.org/officeDocument/2006/relationships" xmlns:w="http://schemas.openxmlformats.org/wordprocessingml/2006/main" xmlns:w14="http://schemas.microsoft.com/office/word/2010/wordml" xmlns:w15="http://schemas.microsoft.com/office/word/2012/wordml" xmlns:w16cex="http://schemas.microsoft.com/office/word/2018/wordml/cex" xmlns:w16cid="http://schemas.microsoft.com/office/word/2016/wordml/cid" xmlns:w16="http://schemas.microsoft.com/office/word/2018/wordml" xmlns:w16du="http://schemas.microsoft.com/office/word/2023/wordml/word16du" xmlns:w16sdtdh="http://schemas.microsoft.com/office/word/2020/wordml/sdtdatahash" xmlns:w16sdtfl="http://schemas.microsoft.com/office/word/2024/wordml/sdtformatlock" xmlns:w16se="http://schemas.microsoft.com/office/word/2015/wordml/symex" mc:Ignorable="w14 w15 w16se w16cid w16 w16cex w16sdtdh w16sdtfl w16du">
   <w:docDefaults>
     <w:rPrDefault>
       <w:rPr>
@@ -19519,7 +19479,7 @@
       </w:rPr>
     </w:tblStylePr>
   </w:style>
-  <w:style w:type="character" w:styleId="Textoennegrita">
+  <w:style w:type="character" w:styleId="Fuerte">
     <w:name w:val="Strong"/>
     <w:basedOn w:val="Fuentedeprrafopredeter"/>
     <w:uiPriority w:val="22"/>
@@ -19902,26 +19862,10 @@
 </file>
 
 <file path=customXml/item1.xml><?xml version="1.0" encoding="utf-8"?>
-<?mso-contentType ?>
-<FormTemplates xmlns="http://schemas.microsoft.com/sharepoint/v3/contenttype/forms">
-  <Display>DocumentLibraryForm</Display>
-  <Edit>DocumentLibraryForm</Edit>
-  <New>DocumentLibraryForm</New>
-</FormTemplates>
+<b:Sources xmlns:b="http://schemas.openxmlformats.org/officeDocument/2006/bibliography" xmlns="http://schemas.openxmlformats.org/officeDocument/2006/bibliography" SelectedStyle="\APASixthEditionOfficeOnline.xsl" StyleName="APA" Version="6"/>
 </file>
 
 <file path=customXml/item2.xml><?xml version="1.0" encoding="utf-8"?>
-<p:properties xmlns:p="http://schemas.microsoft.com/office/2006/metadata/properties" xmlns:xsi="http://www.w3.org/2001/XMLSchema-instance" xmlns:pc="http://schemas.microsoft.com/office/infopath/2007/PartnerControls">
-  <documentManagement>
-    <TaxCatchAll xmlns="b250f519-6473-4480-8c44-6ee3a3a530c3" xsi:nil="true"/>
-    <lcf76f155ced4ddcb4097134ff3c332f xmlns="d174a4fb-80c2-4523-8d89-375030acacbf">
-      <Terms xmlns="http://schemas.microsoft.com/office/infopath/2007/PartnerControls"/>
-    </lcf76f155ced4ddcb4097134ff3c332f>
-  </documentManagement>
-</p:properties>
-</file>
-
-<file path=customXml/item3.xml><?xml version="1.0" encoding="utf-8"?>
 <ct:contentTypeSchema xmlns:ct="http://schemas.microsoft.com/office/2006/metadata/contentType" xmlns:ma="http://schemas.microsoft.com/office/2006/metadata/properties/metaAttributes" ct:_="" ma:_="" ma:contentTypeName="Documento" ma:contentTypeID="0x010100EA8A463C70CDF94EBCEAEE24D04F3F8A" ma:contentTypeVersion="12" ma:contentTypeDescription="Crear nuevo documento." ma:contentTypeScope="" ma:versionID="0a68c197ff11ee8f2a4dfa92d3e5c792">
   <xsd:schema xmlns:xsd="http://www.w3.org/2001/XMLSchema" xmlns:xs="http://www.w3.org/2001/XMLSchema" xmlns:p="http://schemas.microsoft.com/office/2006/metadata/properties" xmlns:ns2="d174a4fb-80c2-4523-8d89-375030acacbf" xmlns:ns3="b250f519-6473-4480-8c44-6ee3a3a530c3" targetNamespace="http://schemas.microsoft.com/office/2006/metadata/properties" ma:root="true" ma:fieldsID="55936f832c432473a7bcdfeafd102760" ns2:_="" ns3:_="">
     <xsd:import namespace="d174a4fb-80c2-4523-8d89-375030acacbf"/>
@@ -20122,30 +20066,35 @@
 </ct:contentTypeSchema>
 </file>
 
+<file path=customXml/item3.xml><?xml version="1.0" encoding="utf-8"?>
+<p:properties xmlns:p="http://schemas.microsoft.com/office/2006/metadata/properties" xmlns:xsi="http://www.w3.org/2001/XMLSchema-instance" xmlns:pc="http://schemas.microsoft.com/office/infopath/2007/PartnerControls">
+  <documentManagement>
+    <TaxCatchAll xmlns="b250f519-6473-4480-8c44-6ee3a3a530c3" xsi:nil="true"/>
+    <lcf76f155ced4ddcb4097134ff3c332f xmlns="d174a4fb-80c2-4523-8d89-375030acacbf">
+      <Terms xmlns="http://schemas.microsoft.com/office/infopath/2007/PartnerControls"/>
+    </lcf76f155ced4ddcb4097134ff3c332f>
+  </documentManagement>
+</p:properties>
+</file>
+
 <file path=customXml/item4.xml><?xml version="1.0" encoding="utf-8"?>
-<b:Sources xmlns:b="http://schemas.openxmlformats.org/officeDocument/2006/bibliography" xmlns="http://schemas.openxmlformats.org/officeDocument/2006/bibliography" SelectedStyle="\APASixthEditionOfficeOnline.xsl" StyleName="APA" Version="6"/>
+<?mso-contentType ?>
+<FormTemplates xmlns="http://schemas.microsoft.com/sharepoint/v3/contenttype/forms">
+  <Display>DocumentLibraryForm</Display>
+  <Edit>DocumentLibraryForm</Edit>
+  <New>DocumentLibraryForm</New>
+</FormTemplates>
 </file>
 
 <file path=customXml/itemProps1.xml><?xml version="1.0" encoding="utf-8"?>
-<ds:datastoreItem xmlns:ds="http://schemas.openxmlformats.org/officeDocument/2006/customXml" ds:itemID="{10663269-2064-4804-8290-36D4A57F5557}">
+<ds:datastoreItem xmlns:ds="http://schemas.openxmlformats.org/officeDocument/2006/customXml" ds:itemID="{EAE431FD-7059-4C09-804B-C9D69EB7B213}">
   <ds:schemaRefs>
-    <ds:schemaRef ds:uri="http://schemas.microsoft.com/sharepoint/v3/contenttype/forms"/>
+    <ds:schemaRef ds:uri="http://schemas.openxmlformats.org/officeDocument/2006/bibliography"/>
   </ds:schemaRefs>
 </ds:datastoreItem>
 </file>
 
 <file path=customXml/itemProps2.xml><?xml version="1.0" encoding="utf-8"?>
-<ds:datastoreItem xmlns:ds="http://schemas.openxmlformats.org/officeDocument/2006/customXml" ds:itemID="{1279454D-02BE-4A9C-A117-DCD1573E2608}">
-  <ds:schemaRefs>
-    <ds:schemaRef ds:uri="http://schemas.microsoft.com/office/2006/metadata/properties"/>
-    <ds:schemaRef ds:uri="http://schemas.microsoft.com/office/infopath/2007/PartnerControls"/>
-    <ds:schemaRef ds:uri="b250f519-6473-4480-8c44-6ee3a3a530c3"/>
-    <ds:schemaRef ds:uri="d174a4fb-80c2-4523-8d89-375030acacbf"/>
-  </ds:schemaRefs>
-</ds:datastoreItem>
-</file>
-
-<file path=customXml/itemProps3.xml><?xml version="1.0" encoding="utf-8"?>
 <ds:datastoreItem xmlns:ds="http://schemas.openxmlformats.org/officeDocument/2006/customXml" ds:itemID="{D6F1C0C7-E20A-467A-A927-12DA1D684955}">
   <ds:schemaRefs>
     <ds:schemaRef ds:uri="http://schemas.microsoft.com/office/2006/metadata/contentType"/>
@@ -20164,10 +20113,21 @@
 </ds:datastoreItem>
 </file>
 
+<file path=customXml/itemProps3.xml><?xml version="1.0" encoding="utf-8"?>
+<ds:datastoreItem xmlns:ds="http://schemas.openxmlformats.org/officeDocument/2006/customXml" ds:itemID="{1279454D-02BE-4A9C-A117-DCD1573E2608}">
+  <ds:schemaRefs>
+    <ds:schemaRef ds:uri="http://schemas.microsoft.com/office/2006/metadata/properties"/>
+    <ds:schemaRef ds:uri="http://schemas.microsoft.com/office/infopath/2007/PartnerControls"/>
+    <ds:schemaRef ds:uri="b250f519-6473-4480-8c44-6ee3a3a530c3"/>
+    <ds:schemaRef ds:uri="d174a4fb-80c2-4523-8d89-375030acacbf"/>
+  </ds:schemaRefs>
+</ds:datastoreItem>
+</file>
+
 <file path=customXml/itemProps4.xml><?xml version="1.0" encoding="utf-8"?>
-<ds:datastoreItem xmlns:ds="http://schemas.openxmlformats.org/officeDocument/2006/customXml" ds:itemID="{EAE431FD-7059-4C09-804B-C9D69EB7B213}">
+<ds:datastoreItem xmlns:ds="http://schemas.openxmlformats.org/officeDocument/2006/customXml" ds:itemID="{10663269-2064-4804-8290-36D4A57F5557}">
   <ds:schemaRefs>
-    <ds:schemaRef ds:uri="http://schemas.openxmlformats.org/officeDocument/2006/bibliography"/>
+    <ds:schemaRef ds:uri="http://schemas.microsoft.com/sharepoint/v3/contenttype/forms"/>
   </ds:schemaRefs>
 </ds:datastoreItem>
 </file>
</xml_diff>